<commit_message>
password story review comment
git-svn-id: http://192.168.20.11/sequoiadb/trunk@36811 6121f079-4a18-41d3-8c30-8870a322f2c2
</commit_message>
<xml_diff>
--- a/internal_doc/03.开发设计/Story-password调整方案.docx
+++ b/internal_doc/03.开发设计/Story-password调整方案.docx
@@ -557,9 +557,6 @@
           <w:p>
             <w:pPr>
               <w:ind w:left="0"/>
-              <w:rPr>
-                <w:rFonts w:hint="eastAsia"/>
-              </w:rPr>
             </w:pPr>
             <w:r>
               <w:rPr>
@@ -624,9 +621,6 @@
                 <w:numId w:val="12"/>
               </w:numPr>
               <w:ind w:firstLineChars="0"/>
-              <w:rPr>
-                <w:rFonts w:hint="eastAsia"/>
-              </w:rPr>
             </w:pPr>
             <w:r>
               <w:rPr>
@@ -657,9 +651,6 @@
           <w:p>
             <w:pPr>
               <w:ind w:left="0"/>
-              <w:rPr>
-                <w:rFonts w:hint="eastAsia"/>
-              </w:rPr>
             </w:pPr>
             <w:r>
               <w:rPr>
@@ -721,9 +712,6 @@
                 <w:numId w:val="18"/>
               </w:numPr>
               <w:ind w:firstLineChars="0"/>
-              <w:rPr>
-                <w:rFonts w:hint="eastAsia"/>
-              </w:rPr>
             </w:pPr>
             <w:r>
               <w:rPr>
@@ -994,6 +982,7 @@
               <w:rPr>
                 <w:rFonts w:hint="eastAsia"/>
               </w:rPr>
+              <w:lastRenderedPageBreak/>
               <w:t>工具名</w:t>
             </w:r>
           </w:p>
@@ -1516,8 +1505,8 @@
         <w:tblLook w:val="04A0" w:firstRow="1" w:lastRow="0" w:firstColumn="1" w:lastColumn="0" w:noHBand="0" w:noVBand="1"/>
       </w:tblPr>
       <w:tblGrid>
-        <w:gridCol w:w="1346"/>
-        <w:gridCol w:w="6224"/>
+        <w:gridCol w:w="1397"/>
+        <w:gridCol w:w="6173"/>
       </w:tblGrid>
       <w:tr>
         <w:tc>
@@ -1633,9 +1622,6 @@
           <w:p>
             <w:pPr>
               <w:ind w:left="0"/>
-              <w:rPr>
-                <w:rFonts w:hint="eastAsia"/>
-              </w:rPr>
             </w:pPr>
             <w:r>
               <w:rPr>
@@ -1653,9 +1639,6 @@
           <w:p>
             <w:pPr>
               <w:ind w:left="0"/>
-              <w:rPr>
-                <w:rFonts w:hint="eastAsia"/>
-              </w:rPr>
             </w:pPr>
             <w:r>
               <w:rPr>
@@ -1684,9 +1667,6 @@
           <w:p>
             <w:pPr>
               <w:ind w:left="0"/>
-              <w:rPr>
-                <w:rFonts w:hint="eastAsia"/>
-              </w:rPr>
             </w:pPr>
             <w:r>
               <w:rPr>
@@ -1707,9 +1687,6 @@
           <w:p>
             <w:pPr>
               <w:ind w:left="0"/>
-              <w:rPr>
-                <w:rFonts w:hint="eastAsia"/>
-              </w:rPr>
             </w:pPr>
             <w:r>
               <w:rPr>
@@ -1947,9 +1924,6 @@
       <w:pPr>
         <w:pStyle w:val="aa"/>
         <w:ind w:left="777" w:firstLineChars="0" w:firstLine="0"/>
-        <w:rPr>
-          <w:rFonts w:hint="eastAsia"/>
-        </w:rPr>
       </w:pPr>
       <w:r>
         <w:rPr>
@@ -2035,6 +2009,7 @@
         </w:rPr>
         <w:t xml:space="preserve">Sdbexprt --user ronin </w:t>
       </w:r>
+      <w:commentRangeStart w:id="0"/>
       <w:r>
         <w:t>–</w:t>
       </w:r>
@@ -2054,7 +2029,20 @@
         <w:rPr>
           <w:rFonts w:hint="eastAsia"/>
         </w:rPr>
-        <w:t xml:space="preserve">token AF0DCA435D [ --ciperFile ./cipher ] </w:t>
+        <w:t xml:space="preserve">token AF0DCA435D </w:t>
+      </w:r>
+      <w:commentRangeEnd w:id="0"/>
+      <w:r>
+        <w:rPr>
+          <w:rStyle w:val="af"/>
+        </w:rPr>
+        <w:commentReference w:id="0"/>
+      </w:r>
+      <w:r>
+        <w:rPr>
+          <w:rFonts w:hint="eastAsia"/>
+        </w:rPr>
+        <w:t xml:space="preserve">[ --ciperFile ./cipher ] </w:t>
       </w:r>
       <w:r>
         <w:rPr>
@@ -2232,6 +2220,7 @@
       <w:pPr>
         <w:ind w:firstLineChars="200" w:firstLine="420"/>
       </w:pPr>
+      <w:commentRangeStart w:id="1"/>
       <w:r>
         <w:rPr>
           <w:rFonts w:hint="eastAsia"/>
@@ -2243,6 +2232,13 @@
           <w:rFonts w:hint="eastAsia"/>
         </w:rPr>
         <w:t>的参数介绍</w:t>
+      </w:r>
+      <w:commentRangeEnd w:id="1"/>
+      <w:r>
+        <w:rPr>
+          <w:rStyle w:val="af"/>
+        </w:rPr>
+        <w:commentReference w:id="1"/>
       </w:r>
     </w:p>
     <w:tbl>
@@ -2253,8 +2249,8 @@
         <w:tblLook w:val="04A0" w:firstRow="1" w:lastRow="0" w:firstColumn="1" w:lastColumn="0" w:noHBand="0" w:noVBand="1"/>
       </w:tblPr>
       <w:tblGrid>
-        <w:gridCol w:w="2022"/>
-        <w:gridCol w:w="2128"/>
+        <w:gridCol w:w="2021"/>
+        <w:gridCol w:w="2129"/>
         <w:gridCol w:w="3443"/>
       </w:tblGrid>
       <w:tr>
@@ -2498,9 +2494,6 @@
           <w:p>
             <w:pPr>
               <w:ind w:left="0"/>
-              <w:rPr>
-                <w:rFonts w:hint="eastAsia"/>
-              </w:rPr>
             </w:pPr>
             <w:r>
               <w:rPr>
@@ -2525,9 +2518,6 @@
           <w:p>
             <w:pPr>
               <w:ind w:left="0"/>
-              <w:rPr>
-                <w:rFonts w:hint="eastAsia"/>
-              </w:rPr>
             </w:pPr>
             <w:r>
               <w:rPr>
@@ -2547,9 +2537,6 @@
           <w:p>
             <w:pPr>
               <w:ind w:left="0"/>
-              <w:rPr>
-                <w:rFonts w:hint="eastAsia"/>
-              </w:rPr>
             </w:pPr>
             <w:r>
               <w:rPr>
@@ -2572,9 +2559,6 @@
           <w:p>
             <w:pPr>
               <w:ind w:left="0"/>
-              <w:rPr>
-                <w:rFonts w:hint="eastAsia"/>
-              </w:rPr>
             </w:pPr>
             <w:r>
               <w:rPr>
@@ -2598,6 +2582,7 @@
               <w:rPr>
                 <w:rFonts w:hint="eastAsia"/>
               </w:rPr>
+              <w:lastRenderedPageBreak/>
               <w:t>--token</w:t>
             </w:r>
           </w:p>
@@ -2738,9 +2723,6 @@
       <w:pPr>
         <w:pStyle w:val="aa"/>
         <w:ind w:left="777" w:firstLineChars="0" w:firstLine="0"/>
-        <w:rPr>
-          <w:rFonts w:hint="eastAsia"/>
-        </w:rPr>
       </w:pPr>
       <w:r>
         <w:rPr>
@@ -3021,10 +3003,7 @@
         <w:t>ser ronin</w:t>
       </w:r>
       <w:r>
-        <w:t xml:space="preserve"> </w:t>
-      </w:r>
-      <w:r>
-        <w:t>--namespace sequoia</w:t>
+        <w:t xml:space="preserve"> --namespace sequoia</w:t>
       </w:r>
     </w:p>
     <w:p>
@@ -3220,9 +3199,6 @@
       <w:pPr>
         <w:pStyle w:val="aa"/>
         <w:ind w:left="777" w:firstLineChars="0" w:firstLine="0"/>
-        <w:rPr>
-          <w:rFonts w:hint="eastAsia"/>
-        </w:rPr>
       </w:pPr>
       <w:r>
         <w:rPr>
@@ -3277,11 +3253,6 @@
       </w:r>
     </w:p>
     <w:p>
-      <w:pPr>
-        <w:rPr>
-          <w:rFonts w:hint="eastAsia"/>
-        </w:rPr>
-      </w:pPr>
       <w:r>
         <w:tab/>
       </w:r>
@@ -3330,9 +3301,6 @@
       <w:pPr>
         <w:pStyle w:val="aa"/>
         <w:ind w:left="777" w:firstLineChars="0" w:firstLine="0"/>
-        <w:rPr>
-          <w:rFonts w:hint="eastAsia"/>
-        </w:rPr>
       </w:pPr>
       <w:r>
         <w:rPr>
@@ -3423,9 +3391,6 @@
       <w:pPr>
         <w:pStyle w:val="aa"/>
         <w:ind w:left="777" w:firstLineChars="0" w:firstLine="0"/>
-        <w:rPr>
-          <w:rFonts w:hint="eastAsia"/>
-        </w:rPr>
       </w:pPr>
       <w:r>
         <w:t>n</w:t>
@@ -3447,9 +3412,6 @@
       <w:pPr>
         <w:pStyle w:val="aa"/>
         <w:ind w:left="777" w:firstLineChars="0" w:firstLine="0"/>
-        <w:rPr>
-          <w:rFonts w:hint="eastAsia"/>
-        </w:rPr>
       </w:pPr>
     </w:p>
     <w:p>
@@ -3575,6 +3537,7 @@
         <w:pStyle w:val="aa"/>
         <w:ind w:left="777" w:firstLineChars="0" w:firstLine="0"/>
       </w:pPr>
+      <w:commentRangeStart w:id="2"/>
       <w:r>
         <w:rPr>
           <w:noProof/>
@@ -3595,7 +3558,7 @@
                     <pic:cNvPicPr/>
                   </pic:nvPicPr>
                   <pic:blipFill>
-                    <a:blip r:embed="rId8"/>
+                    <a:blip r:embed="rId10"/>
                     <a:stretch>
                       <a:fillRect/>
                     </a:stretch>
@@ -3615,6 +3578,13 @@
           </wp:inline>
         </w:drawing>
       </w:r>
+      <w:commentRangeEnd w:id="2"/>
+      <w:r>
+        <w:rPr>
+          <w:rStyle w:val="af"/>
+        </w:rPr>
+        <w:commentReference w:id="2"/>
+      </w:r>
     </w:p>
     <w:p>
       <w:pPr>
@@ -3715,9 +3685,6 @@
       <w:pPr>
         <w:pStyle w:val="aa"/>
         <w:ind w:left="777" w:firstLineChars="0" w:firstLine="0"/>
-        <w:rPr>
-          <w:rFonts w:hint="eastAsia"/>
-        </w:rPr>
       </w:pPr>
       <w:r>
         <w:rPr>
@@ -3739,7 +3706,7 @@
                     <pic:cNvPicPr/>
                   </pic:nvPicPr>
                   <pic:blipFill>
-                    <a:blip r:embed="rId9"/>
+                    <a:blip r:embed="rId11"/>
                     <a:stretch>
                       <a:fillRect/>
                     </a:stretch>
@@ -3764,9 +3731,6 @@
       <w:pPr>
         <w:pStyle w:val="aa"/>
         <w:ind w:left="777" w:firstLineChars="0" w:firstLine="0"/>
-        <w:rPr>
-          <w:rFonts w:hint="eastAsia"/>
-        </w:rPr>
       </w:pPr>
     </w:p>
     <w:p>
@@ -3816,7 +3780,21 @@
         <w:rPr>
           <w:rFonts w:hint="eastAsia"/>
         </w:rPr>
-        <w:t xml:space="preserve"> user, password, cipherFile, token </w:t>
+        <w:t xml:space="preserve"> </w:t>
+      </w:r>
+      <w:commentRangeStart w:id="3"/>
+      <w:r>
+        <w:rPr>
+          <w:rFonts w:hint="eastAsia"/>
+        </w:rPr>
+        <w:t xml:space="preserve">user, password, cipherFile, token </w:t>
+      </w:r>
+      <w:commentRangeEnd w:id="3"/>
+      <w:r>
+        <w:rPr>
+          <w:rStyle w:val="af"/>
+        </w:rPr>
+        <w:commentReference w:id="3"/>
       </w:r>
       <w:r>
         <w:rPr>
@@ -3877,9 +3855,6 @@
       <w:pPr>
         <w:pStyle w:val="aa"/>
         <w:ind w:left="1137" w:firstLineChars="0" w:firstLine="0"/>
-        <w:rPr>
-          <w:rFonts w:hint="eastAsia"/>
-        </w:rPr>
       </w:pPr>
       <w:r>
         <w:rPr>
@@ -3897,13 +3872,27 @@
         <w:rPr>
           <w:rFonts w:hint="eastAsia"/>
         </w:rPr>
-        <w:t>，交互提示输入密码，回归</w:t>
-      </w:r>
-      <w:r>
-        <w:rPr>
-          <w:rFonts w:hint="eastAsia"/>
-        </w:rPr>
-        <w:t>传统方式连接；</w:t>
+        <w:t>，交互提示输入密码，</w:t>
+      </w:r>
+      <w:commentRangeStart w:id="4"/>
+      <w:r>
+        <w:rPr>
+          <w:rFonts w:hint="eastAsia"/>
+        </w:rPr>
+        <w:t>回归传统方式连接</w:t>
+      </w:r>
+      <w:commentRangeEnd w:id="4"/>
+      <w:r>
+        <w:rPr>
+          <w:rStyle w:val="af"/>
+        </w:rPr>
+        <w:commentReference w:id="4"/>
+      </w:r>
+      <w:r>
+        <w:rPr>
+          <w:rFonts w:hint="eastAsia"/>
+        </w:rPr>
+        <w:t>；</w:t>
       </w:r>
     </w:p>
     <w:p>
@@ -3958,9 +3947,6 @@
       <w:pPr>
         <w:pStyle w:val="aa"/>
         <w:ind w:left="1137" w:firstLineChars="0" w:firstLine="0"/>
-        <w:rPr>
-          <w:rFonts w:hint="eastAsia"/>
-        </w:rPr>
       </w:pPr>
       <w:r>
         <w:rPr>
@@ -4029,27 +4015,10 @@
         <w:rPr>
           <w:rFonts w:hint="eastAsia"/>
         </w:rPr>
-        <w:t>解密获得密码，</w:t>
-      </w:r>
-      <w:r>
-        <w:rPr>
-          <w:rFonts w:hint="eastAsia"/>
-        </w:rPr>
-        <w:t>回归</w:t>
-      </w:r>
-      <w:r>
-        <w:rPr>
-          <w:rFonts w:hint="eastAsia"/>
-        </w:rPr>
-        <w:t>传统方式连接</w:t>
-      </w:r>
-    </w:p>
-    <w:p>
-      <w:pPr>
-        <w:rPr>
-          <w:rFonts w:hint="eastAsia"/>
-        </w:rPr>
-      </w:pPr>
+        <w:t>解密获得密码，回归传统方式连接</w:t>
+      </w:r>
+    </w:p>
+    <w:p>
       <w:r>
         <w:tab/>
       </w:r>
@@ -4112,13 +4081,7 @@
         <w:ind w:left="777"/>
       </w:pPr>
       <w:r>
-        <w:t xml:space="preserve">            </w:t>
-      </w:r>
-      <w:r>
-        <w:t xml:space="preserve">                            </w:t>
-      </w:r>
-      <w:r>
-        <w:t>int serverNum,</w:t>
+        <w:t xml:space="preserve">                                        int serverNum,</w:t>
       </w:r>
     </w:p>
     <w:p>
@@ -4127,13 +4090,7 @@
         <w:ind w:left="777"/>
       </w:pPr>
       <w:r>
-        <w:t xml:space="preserve">                   </w:t>
-      </w:r>
-      <w:r>
-        <w:t xml:space="preserve">                     </w:t>
-      </w:r>
-      <w:r>
-        <w:t>const char *usr,</w:t>
+        <w:t xml:space="preserve">                                        const char *usr,</w:t>
       </w:r>
     </w:p>
     <w:p>
@@ -4267,13 +4224,7 @@
         <w:ind w:left="777"/>
       </w:pPr>
       <w:r>
-        <w:t xml:space="preserve">            </w:t>
-      </w:r>
-      <w:r>
-        <w:t xml:space="preserve">                            </w:t>
-      </w:r>
-      <w:r>
-        <w:t>const char *preference_instance,</w:t>
+        <w:t xml:space="preserve">                                        const char *preference_instance,</w:t>
       </w:r>
     </w:p>
     <w:p>
@@ -4282,13 +4233,7 @@
         <w:ind w:left="777"/>
       </w:pPr>
       <w:r>
-        <w:t xml:space="preserve">            </w:t>
-      </w:r>
-      <w:r>
-        <w:t xml:space="preserve">                            </w:t>
-      </w:r>
-      <w:r>
-        <w:t>const char *preference_instance_mode,</w:t>
+        <w:t xml:space="preserve">                                        const char *preference_instance_mode,</w:t>
       </w:r>
     </w:p>
     <w:p>
@@ -4297,13 +4242,7 @@
         <w:ind w:left="777"/>
       </w:pPr>
       <w:r>
-        <w:t xml:space="preserve">            </w:t>
-      </w:r>
-      <w:r>
-        <w:t xml:space="preserve">                            </w:t>
-      </w:r>
-      <w:r>
-        <w:t>int session_timeout,</w:t>
+        <w:t xml:space="preserve">                                        int session_timeout,</w:t>
       </w:r>
     </w:p>
     <w:p>
@@ -4312,13 +4251,7 @@
         <w:ind w:left="777" w:firstLineChars="0" w:firstLine="0"/>
       </w:pPr>
       <w:r>
-        <w:t xml:space="preserve">                                           </w:t>
-      </w:r>
-      <w:r>
-        <w:t xml:space="preserve"> </w:t>
-      </w:r>
-      <w:r>
-        <w:t>const char *transaction )</w:t>
+        <w:t xml:space="preserve">                                            const char *transaction )</w:t>
       </w:r>
       <w:r>
         <w:rPr>
@@ -4403,11 +4336,6 @@
       </w:r>
     </w:p>
     <w:p>
-      <w:pPr>
-        <w:rPr>
-          <w:rFonts w:hint="eastAsia"/>
-        </w:rPr>
-      </w:pPr>
       <w:r>
         <w:tab/>
       </w:r>
@@ -4459,10 +4387,10 @@
         <w:tblLook w:val="04A0" w:firstRow="1" w:lastRow="0" w:firstColumn="1" w:lastColumn="0" w:noHBand="0" w:noVBand="1"/>
       </w:tblPr>
       <w:tblGrid>
-        <w:gridCol w:w="426"/>
-        <w:gridCol w:w="4296"/>
-        <w:gridCol w:w="1840"/>
-        <w:gridCol w:w="1616"/>
+        <w:gridCol w:w="504"/>
+        <w:gridCol w:w="4079"/>
+        <w:gridCol w:w="1968"/>
+        <w:gridCol w:w="1614"/>
       </w:tblGrid>
       <w:tr>
         <w:tc>
@@ -4472,9 +4400,6 @@
           <w:p>
             <w:pPr>
               <w:ind w:left="0"/>
-              <w:rPr>
-                <w:rFonts w:hint="eastAsia"/>
-              </w:rPr>
             </w:pPr>
             <w:r>
               <w:rPr>
@@ -4491,9 +4416,6 @@
           <w:p>
             <w:pPr>
               <w:ind w:left="0"/>
-              <w:rPr>
-                <w:rFonts w:hint="eastAsia"/>
-              </w:rPr>
             </w:pPr>
             <w:r>
               <w:rPr>
@@ -4510,9 +4432,6 @@
           <w:p>
             <w:pPr>
               <w:ind w:left="0"/>
-              <w:rPr>
-                <w:rFonts w:hint="eastAsia"/>
-              </w:rPr>
             </w:pPr>
             <w:r>
               <w:rPr>
@@ -4529,9 +4448,6 @@
           <w:p>
             <w:pPr>
               <w:ind w:left="0"/>
-              <w:rPr>
-                <w:rFonts w:hint="eastAsia"/>
-              </w:rPr>
             </w:pPr>
             <w:r>
               <w:rPr>
@@ -4583,6 +4499,7 @@
             <w:pPr>
               <w:ind w:left="0"/>
             </w:pPr>
+            <w:commentRangeStart w:id="5"/>
             <w:r>
               <w:rPr>
                 <w:rFonts w:hint="eastAsia"/>
@@ -4613,6 +4530,13 @@
               </w:rPr>
               <w:t>中。</w:t>
             </w:r>
+            <w:commentRangeEnd w:id="5"/>
+            <w:r>
+              <w:rPr>
+                <w:rStyle w:val="af"/>
+              </w:rPr>
+              <w:commentReference w:id="5"/>
+            </w:r>
           </w:p>
         </w:tc>
         <w:tc>
@@ -4622,9 +4546,6 @@
           <w:p>
             <w:pPr>
               <w:ind w:left="0"/>
-              <w:rPr>
-                <w:rFonts w:hint="eastAsia"/>
-              </w:rPr>
             </w:pPr>
             <w:r>
               <w:rPr>
@@ -4710,13 +4631,7 @@
               <w:rPr>
                 <w:rFonts w:hint="eastAsia"/>
               </w:rPr>
-              <w:t>设置加密文件</w:t>
-            </w:r>
-            <w:r>
-              <w:rPr>
-                <w:rFonts w:hint="eastAsia"/>
-              </w:rPr>
-              <w:t>，保存在下面的静态变量中</w:t>
+              <w:t>设置加密文件，保存在下面的静态变量中</w:t>
             </w:r>
           </w:p>
         </w:tc>
@@ -4761,9 +4676,6 @@
           <w:p>
             <w:pPr>
               <w:ind w:left="0"/>
-              <w:rPr>
-                <w:rFonts w:hint="eastAsia"/>
-              </w:rPr>
             </w:pPr>
             <w:r>
               <w:rPr>
@@ -4798,9 +4710,6 @@
           <w:p>
             <w:pPr>
               <w:ind w:left="0"/>
-              <w:rPr>
-                <w:rFonts w:hint="eastAsia"/>
-              </w:rPr>
             </w:pPr>
             <w:r>
               <w:rPr>
@@ -4851,9 +4760,6 @@
           <w:p>
             <w:pPr>
               <w:ind w:left="0"/>
-              <w:rPr>
-                <w:rFonts w:hint="eastAsia"/>
-              </w:rPr>
             </w:pPr>
             <w:r>
               <w:rPr>
@@ -4876,9 +4782,6 @@
           <w:p>
             <w:pPr>
               <w:ind w:left="0"/>
-              <w:rPr>
-                <w:rFonts w:hint="eastAsia"/>
-              </w:rPr>
             </w:pPr>
             <w:r>
               <w:rPr>
@@ -5037,11 +4940,6 @@
     </w:tbl>
     <w:p/>
     <w:p>
-      <w:pPr>
-        <w:rPr>
-          <w:rFonts w:hint="eastAsia"/>
-        </w:rPr>
-      </w:pPr>
       <w:r>
         <w:t xml:space="preserve">Postgres fdw </w:t>
       </w:r>
@@ -5082,10 +4980,7 @@
         <w:t>Set</w:t>
       </w:r>
       <w:r>
-        <w:t>CipherFile</w:t>
-      </w:r>
-      <w:r>
-        <w:t>()</w:t>
+        <w:t>CipherFile()</w:t>
       </w:r>
       <w:r>
         <w:rPr>
@@ -5116,11 +5011,6 @@
       </w:r>
     </w:p>
     <w:p>
-      <w:pPr>
-        <w:rPr>
-          <w:rFonts w:hint="eastAsia"/>
-        </w:rPr>
-      </w:pPr>
       <w:r>
         <w:tab/>
       </w:r>
@@ -5458,9 +5348,6 @@
     <w:p>
       <w:pPr>
         <w:ind w:left="777"/>
-        <w:rPr>
-          <w:rFonts w:hint="eastAsia"/>
-        </w:rPr>
       </w:pPr>
       <w:r>
         <w:rPr>
@@ -5489,8 +5376,8 @@
         <w:tblLook w:val="04A0" w:firstRow="1" w:lastRow="0" w:firstColumn="1" w:lastColumn="0" w:noHBand="0" w:noVBand="1"/>
       </w:tblPr>
       <w:tblGrid>
-        <w:gridCol w:w="8429"/>
-        <w:gridCol w:w="2126"/>
+        <w:gridCol w:w="6233"/>
+        <w:gridCol w:w="1512"/>
       </w:tblGrid>
       <w:tr>
         <w:tc>
@@ -5501,9 +5388,6 @@
             <w:pPr>
               <w:pStyle w:val="aa"/>
               <w:ind w:left="0" w:firstLineChars="0" w:firstLine="0"/>
-              <w:rPr>
-                <w:rFonts w:hint="eastAsia"/>
-              </w:rPr>
             </w:pPr>
             <w:r>
               <w:rPr>
@@ -5569,21 +5453,12 @@
             <w:pPr>
               <w:pStyle w:val="aa"/>
               <w:ind w:left="0" w:firstLineChars="0" w:firstLine="0"/>
-              <w:rPr>
-                <w:rFonts w:hint="eastAsia"/>
-              </w:rPr>
-            </w:pPr>
-            <w:r>
-              <w:rPr>
-                <w:rFonts w:hint="eastAsia"/>
-              </w:rPr>
-              <w:t>在加密文件中寻找对应用户</w:t>
-            </w:r>
-            <w:r>
-              <w:rPr>
-                <w:rFonts w:hint="eastAsia"/>
-              </w:rPr>
-              <w:t>密文并解密</w:t>
+            </w:pPr>
+            <w:r>
+              <w:rPr>
+                <w:rFonts w:hint="eastAsia"/>
+              </w:rPr>
+              <w:t>在加密文件中寻找对应用户密文并解密</w:t>
             </w:r>
           </w:p>
         </w:tc>
@@ -5599,9 +5474,6 @@
       <w:pPr>
         <w:pStyle w:val="aa"/>
         <w:ind w:left="777" w:firstLineChars="0" w:firstLine="0"/>
-        <w:rPr>
-          <w:rFonts w:hint="eastAsia"/>
-        </w:rPr>
       </w:pPr>
       <w:r>
         <w:rPr>
@@ -5619,13 +5491,7 @@
         <w:rPr>
           <w:rFonts w:hint="eastAsia"/>
         </w:rPr>
-        <w:t>中，该头文件</w:t>
-      </w:r>
-      <w:r>
-        <w:rPr>
-          <w:rFonts w:hint="eastAsia"/>
-        </w:rPr>
-        <w:t>只有在编译定义了</w:t>
+        <w:t>中，该头文件只有在编译定义了</w:t>
       </w:r>
       <w:r>
         <w:rPr>
@@ -5637,13 +5503,7 @@
         <w:rPr>
           <w:rFonts w:hint="eastAsia"/>
         </w:rPr>
-        <w:t>时</w:t>
-      </w:r>
-      <w:r>
-        <w:rPr>
-          <w:rFonts w:hint="eastAsia"/>
-        </w:rPr>
-        <w:t>才引用。</w:t>
+        <w:t>时才引用。</w:t>
       </w:r>
     </w:p>
     <w:p>
@@ -5887,9 +5747,6 @@
       <w:pPr>
         <w:pStyle w:val="aa"/>
         <w:ind w:left="777" w:firstLineChars="0" w:firstLine="0"/>
-        <w:rPr>
-          <w:rFonts w:hint="eastAsia"/>
-        </w:rPr>
       </w:pPr>
     </w:p>
     <w:p>
@@ -5991,21 +5848,12 @@
           <w:numId w:val="11"/>
         </w:numPr>
         <w:ind w:firstLineChars="0"/>
-        <w:rPr>
-          <w:rFonts w:hint="eastAsia"/>
-        </w:rPr>
-      </w:pPr>
-      <w:r>
-        <w:rPr>
-          <w:rFonts w:hint="eastAsia"/>
-        </w:rPr>
-        <w:t>将</w:t>
-      </w:r>
-      <w:r>
-        <w:rPr>
-          <w:rFonts w:hint="eastAsia"/>
-        </w:rPr>
-        <w:t>用户名、</w:t>
+      </w:pPr>
+      <w:r>
+        <w:rPr>
+          <w:rFonts w:hint="eastAsia"/>
+        </w:rPr>
+        <w:t>将用户名、</w:t>
       </w:r>
       <w:r>
         <w:rPr>
@@ -6017,13 +5865,7 @@
         <w:rPr>
           <w:rFonts w:hint="eastAsia"/>
         </w:rPr>
-        <w:t>和密文</w:t>
-      </w:r>
-      <w:r>
-        <w:rPr>
-          <w:rFonts w:hint="eastAsia"/>
-        </w:rPr>
-        <w:t>保存在加密文件中。</w:t>
+        <w:t>和密文保存在加密文件中。</w:t>
       </w:r>
     </w:p>
     <w:p>
@@ -6066,20 +5908,27 @@
       <w:pPr>
         <w:pStyle w:val="aa"/>
         <w:ind w:left="777" w:firstLineChars="0" w:firstLine="0"/>
-        <w:rPr>
-          <w:rFonts w:hint="eastAsia"/>
-        </w:rPr>
       </w:pPr>
     </w:p>
     <w:p>
       <w:pPr>
         <w:pStyle w:val="3"/>
       </w:pPr>
+      <w:commentRangeStart w:id="6"/>
       <w:r>
         <w:rPr>
           <w:rFonts w:hint="eastAsia"/>
         </w:rPr>
         <w:t>加密方案</w:t>
+      </w:r>
+      <w:commentRangeEnd w:id="6"/>
+      <w:r>
+        <w:rPr>
+          <w:rStyle w:val="af"/>
+          <w:b w:val="0"/>
+          <w:bCs w:val="0"/>
+        </w:rPr>
+        <w:commentReference w:id="6"/>
       </w:r>
     </w:p>
     <w:p>
@@ -6175,6 +6024,7 @@
         </w:numPr>
         <w:ind w:firstLineChars="0"/>
       </w:pPr>
+      <w:commentRangeStart w:id="7"/>
       <w:r>
         <w:rPr>
           <w:rFonts w:hint="eastAsia"/>
@@ -6193,13 +6043,17 @@
         </w:rPr>
         <w:t>。</w:t>
       </w:r>
+      <w:commentRangeEnd w:id="7"/>
+      <w:r>
+        <w:rPr>
+          <w:rStyle w:val="af"/>
+        </w:rPr>
+        <w:commentReference w:id="7"/>
+      </w:r>
     </w:p>
     <w:p>
       <w:pPr>
         <w:ind w:left="777"/>
-        <w:rPr>
-          <w:rFonts w:hint="eastAsia"/>
-        </w:rPr>
       </w:pPr>
     </w:p>
     <w:p>
@@ -6546,9 +6400,6 @@
     <w:p>
       <w:pPr>
         <w:ind w:left="777"/>
-        <w:rPr>
-          <w:rFonts w:hint="eastAsia"/>
-        </w:rPr>
       </w:pPr>
     </w:p>
     <w:p>
@@ -6613,9 +6464,6 @@
     <w:p>
       <w:pPr>
         <w:ind w:left="777"/>
-        <w:rPr>
-          <w:rFonts w:hint="eastAsia"/>
-        </w:rPr>
       </w:pPr>
       <w:r>
         <w:rPr>
@@ -6698,17 +6546,11 @@
     <w:p>
       <w:pPr>
         <w:ind w:left="777"/>
-        <w:rPr>
-          <w:rFonts w:hint="eastAsia"/>
-        </w:rPr>
       </w:pPr>
     </w:p>
     <w:p>
       <w:pPr>
         <w:ind w:left="777"/>
-        <w:rPr>
-          <w:rFonts w:hint="eastAsia"/>
-        </w:rPr>
       </w:pPr>
       <w:r>
         <w:rPr>
@@ -6802,6 +6644,8 @@
         </w:rPr>
         <w:t>；</w:t>
       </w:r>
+      <w:bookmarkStart w:id="8" w:name="_GoBack"/>
+      <w:bookmarkEnd w:id="8"/>
     </w:p>
     <w:p>
       <w:pPr>
@@ -6811,9 +6655,6 @@
           <w:numId w:val="16"/>
         </w:numPr>
         <w:ind w:firstLineChars="0"/>
-        <w:rPr>
-          <w:rFonts w:hint="eastAsia"/>
-        </w:rPr>
       </w:pPr>
       <w:r>
         <w:rPr>
@@ -7096,9 +6937,6 @@
     <w:p>
       <w:pPr>
         <w:ind w:left="777"/>
-        <w:rPr>
-          <w:rFonts w:hint="eastAsia"/>
-        </w:rPr>
       </w:pPr>
       <w:r>
         <w:rPr>
@@ -7142,8 +6980,6 @@
         </w:rPr>
         <w:t>。</w:t>
       </w:r>
-      <w:bookmarkStart w:id="0" w:name="_GoBack"/>
-      <w:bookmarkEnd w:id="0"/>
     </w:p>
     <w:p>
       <w:pPr>
@@ -8188,9 +8024,6 @@
           <w:p>
             <w:pPr>
               <w:ind w:left="0"/>
-              <w:rPr>
-                <w:rFonts w:hint="eastAsia"/>
-              </w:rPr>
             </w:pPr>
           </w:p>
         </w:tc>
@@ -8683,6 +8516,380 @@
     </w:sectPr>
   </w:body>
 </w:document>
+</file>
+
+<file path=word/comments.xml><?xml version="1.0" encoding="utf-8"?>
+<w:comments xmlns:wpc="http://schemas.microsoft.com/office/word/2010/wordprocessingCanvas" xmlns:cx="http://schemas.microsoft.com/office/drawing/2014/chartex" xmlns:mc="http://schemas.openxmlformats.org/markup-compatibility/2006" xmlns:o="urn:schemas-microsoft-com:office:office" xmlns:r="http://schemas.openxmlformats.org/officeDocument/2006/relationships" xmlns:m="http://schemas.openxmlformats.org/officeDocument/2006/math" xmlns:v="urn:schemas-microsoft-com:vml" xmlns:wp14="http://schemas.microsoft.com/office/word/2010/wordprocessingDrawing" xmlns:wp="http://schemas.openxmlformats.org/drawingml/2006/wordprocessingDrawing" xmlns:w10="urn:schemas-microsoft-com:office:word" xmlns:w="http://schemas.openxmlformats.org/wordprocessingml/2006/main" xmlns:w14="http://schemas.microsoft.com/office/word/2010/wordml" xmlns:w15="http://schemas.microsoft.com/office/word/2012/wordml" xmlns:w16se="http://schemas.microsoft.com/office/word/2015/wordml/symex" xmlns:wpg="http://schemas.microsoft.com/office/word/2010/wordprocessingGroup" xmlns:wpi="http://schemas.microsoft.com/office/word/2010/wordprocessingInk" xmlns:wne="http://schemas.microsoft.com/office/word/2006/wordml" xmlns:wps="http://schemas.microsoft.com/office/word/2010/wordprocessingShape" mc:Ignorable="w14 w15 w16se wp14">
+  <w:comment w:id="0" w:author="yangshangde" w:date="2018-09-12T10:45:00Z" w:initials="y">
+    <w:p>
+      <w:pPr>
+        <w:pStyle w:val="af0"/>
+      </w:pPr>
+      <w:r>
+        <w:rPr>
+          <w:rStyle w:val="af"/>
+        </w:rPr>
+        <w:annotationRef/>
+      </w:r>
+      <w:r>
+        <w:rPr>
+          <w:rFonts w:hint="eastAsia"/>
+        </w:rPr>
+        <w:t>语法中需要注明哪些是必选，哪些是可选，能够怎么组合。</w:t>
+      </w:r>
+    </w:p>
+    <w:p>
+      <w:pPr>
+        <w:pStyle w:val="af0"/>
+      </w:pPr>
+      <w:r>
+        <w:t>namespace</w:t>
+      </w:r>
+      <w:r>
+        <w:rPr>
+          <w:rFonts w:hint="eastAsia"/>
+        </w:rPr>
+        <w:t xml:space="preserve"> </w:t>
+      </w:r>
+      <w:r>
+        <w:rPr>
+          <w:rFonts w:hint="eastAsia"/>
+        </w:rPr>
+        <w:t>与</w:t>
+      </w:r>
+      <w:r>
+        <w:rPr>
+          <w:rFonts w:hint="eastAsia"/>
+        </w:rPr>
+        <w:t xml:space="preserve"> token </w:t>
+      </w:r>
+      <w:r>
+        <w:rPr>
+          <w:rFonts w:hint="eastAsia"/>
+        </w:rPr>
+        <w:t>是不是都可以不指定？</w:t>
+      </w:r>
+    </w:p>
+    <w:p>
+      <w:pPr>
+        <w:pStyle w:val="af0"/>
+        <w:rPr>
+          <w:rFonts w:hint="eastAsia"/>
+        </w:rPr>
+      </w:pPr>
+      <w:r>
+        <w:rPr>
+          <w:rFonts w:hint="eastAsia"/>
+        </w:rPr>
+        <w:t>不指定的时候如何处理的？之前讨论生成的时候，不指定</w:t>
+      </w:r>
+      <w:r>
+        <w:rPr>
+          <w:rFonts w:hint="eastAsia"/>
+        </w:rPr>
+        <w:t xml:space="preserve"> token</w:t>
+      </w:r>
+      <w:r>
+        <w:rPr>
+          <w:rFonts w:hint="eastAsia"/>
+        </w:rPr>
+        <w:t>，是自动生成</w:t>
+      </w:r>
+    </w:p>
+  </w:comment>
+  <w:comment w:id="1" w:author="yangshangde" w:date="2018-09-12T10:48:00Z" w:initials="y">
+    <w:p>
+      <w:pPr>
+        <w:pStyle w:val="af0"/>
+      </w:pPr>
+      <w:r>
+        <w:rPr>
+          <w:rStyle w:val="af"/>
+        </w:rPr>
+        <w:annotationRef/>
+      </w:r>
+      <w:r>
+        <w:rPr>
+          <w:rFonts w:hint="eastAsia"/>
+        </w:rPr>
+        <w:t>增加必选，可选列</w:t>
+      </w:r>
+    </w:p>
+    <w:p>
+      <w:pPr>
+        <w:pStyle w:val="af0"/>
+      </w:pPr>
+      <w:r>
+        <w:t xml:space="preserve">Namespace </w:t>
+      </w:r>
+      <w:r>
+        <w:rPr>
+          <w:rFonts w:hint="eastAsia"/>
+        </w:rPr>
+        <w:t>没有指定时的处理</w:t>
+      </w:r>
+    </w:p>
+    <w:p>
+      <w:pPr>
+        <w:pStyle w:val="af0"/>
+      </w:pPr>
+      <w:r>
+        <w:t xml:space="preserve">token </w:t>
+      </w:r>
+      <w:r>
+        <w:rPr>
+          <w:rFonts w:hint="eastAsia"/>
+        </w:rPr>
+        <w:t>的分散存储</w:t>
+      </w:r>
+    </w:p>
+    <w:p>
+      <w:pPr>
+        <w:pStyle w:val="af0"/>
+      </w:pPr>
+    </w:p>
+    <w:p>
+      <w:pPr>
+        <w:pStyle w:val="af0"/>
+        <w:rPr>
+          <w:rFonts w:hint="eastAsia"/>
+        </w:rPr>
+      </w:pPr>
+      <w:r>
+        <w:rPr>
+          <w:rFonts w:hint="eastAsia"/>
+        </w:rPr>
+        <w:t>密码文件的存储结构需要完善</w:t>
+      </w:r>
+    </w:p>
+  </w:comment>
+  <w:comment w:id="2" w:author="yangshangde" w:date="2018-09-12T11:03:00Z" w:initials="y">
+    <w:p>
+      <w:pPr>
+        <w:pStyle w:val="af0"/>
+        <w:rPr>
+          <w:rFonts w:hint="eastAsia"/>
+        </w:rPr>
+      </w:pPr>
+      <w:r>
+        <w:rPr>
+          <w:rStyle w:val="af"/>
+        </w:rPr>
+        <w:annotationRef/>
+      </w:r>
+      <w:r>
+        <w:rPr>
+          <w:rFonts w:hint="eastAsia"/>
+        </w:rPr>
+        <w:t>为什么要提供两个</w:t>
+      </w:r>
+      <w:r>
+        <w:rPr>
+          <w:rFonts w:hint="eastAsia"/>
+        </w:rPr>
+        <w:t xml:space="preserve"> public </w:t>
+      </w:r>
+      <w:r>
+        <w:rPr>
+          <w:rFonts w:hint="eastAsia"/>
+        </w:rPr>
+        <w:t>的</w:t>
+      </w:r>
+      <w:r>
+        <w:rPr>
+          <w:rFonts w:hint="eastAsia"/>
+        </w:rPr>
+        <w:t xml:space="preserve"> init </w:t>
+      </w:r>
+      <w:r>
+        <w:rPr>
+          <w:rFonts w:hint="eastAsia"/>
+        </w:rPr>
+        <w:t>函数</w:t>
+      </w:r>
+      <w:r>
+        <w:rPr>
+          <w:rFonts w:hint="eastAsia"/>
+        </w:rPr>
+        <w:t xml:space="preserve"> </w:t>
+      </w:r>
+      <w:r>
+        <w:rPr>
+          <w:rFonts w:hint="eastAsia"/>
+        </w:rPr>
+        <w:t>？</w:t>
+      </w:r>
+    </w:p>
+  </w:comment>
+  <w:comment w:id="3" w:author="yangshangde" w:date="2018-09-12T11:06:00Z" w:initials="y">
+    <w:p>
+      <w:pPr>
+        <w:pStyle w:val="af0"/>
+      </w:pPr>
+      <w:r>
+        <w:rPr>
+          <w:rStyle w:val="af"/>
+        </w:rPr>
+        <w:annotationRef/>
+      </w:r>
+      <w:r>
+        <w:t xml:space="preserve">Namespace </w:t>
+      </w:r>
+      <w:r>
+        <w:rPr>
+          <w:rFonts w:hint="eastAsia"/>
+        </w:rPr>
+        <w:t>呢？</w:t>
+      </w:r>
+    </w:p>
+    <w:p>
+      <w:pPr>
+        <w:pStyle w:val="af0"/>
+        <w:rPr>
+          <w:rFonts w:hint="eastAsia"/>
+        </w:rPr>
+      </w:pPr>
+      <w:r>
+        <w:rPr>
+          <w:rFonts w:hint="eastAsia"/>
+        </w:rPr>
+        <w:t>自动生成的</w:t>
+      </w:r>
+      <w:r>
+        <w:rPr>
+          <w:rFonts w:hint="eastAsia"/>
+        </w:rPr>
+        <w:t xml:space="preserve"> token </w:t>
+      </w:r>
+      <w:r>
+        <w:rPr>
+          <w:rFonts w:hint="eastAsia"/>
+        </w:rPr>
+        <w:t>呢？</w:t>
+      </w:r>
+    </w:p>
+    <w:p>
+      <w:pPr>
+        <w:pStyle w:val="af0"/>
+        <w:ind w:left="0"/>
+        <w:rPr>
+          <w:rFonts w:hint="eastAsia"/>
+        </w:rPr>
+      </w:pPr>
+    </w:p>
+  </w:comment>
+  <w:comment w:id="4" w:author="yangshangde" w:date="2018-09-12T11:05:00Z" w:initials="y">
+    <w:p>
+      <w:pPr>
+        <w:pStyle w:val="af0"/>
+      </w:pPr>
+      <w:r>
+        <w:rPr>
+          <w:rFonts w:hint="eastAsia"/>
+        </w:rPr>
+        <w:t>什么意思</w:t>
+      </w:r>
+      <w:r>
+        <w:rPr>
+          <w:rFonts w:hint="eastAsia"/>
+        </w:rPr>
+        <w:t xml:space="preserve"> </w:t>
+      </w:r>
+      <w:r>
+        <w:rPr>
+          <w:rFonts w:hint="eastAsia"/>
+        </w:rPr>
+        <w:t>？</w:t>
+      </w:r>
+    </w:p>
+  </w:comment>
+  <w:comment w:id="5" w:author="yangshangde" w:date="2018-09-12T11:11:00Z" w:initials="y">
+    <w:p>
+      <w:pPr>
+        <w:pStyle w:val="af0"/>
+        <w:rPr>
+          <w:rFonts w:hint="eastAsia"/>
+        </w:rPr>
+      </w:pPr>
+      <w:r>
+        <w:rPr>
+          <w:rStyle w:val="af"/>
+        </w:rPr>
+        <w:annotationRef/>
+      </w:r>
+      <w:r>
+        <w:rPr>
+          <w:rFonts w:hint="eastAsia"/>
+        </w:rPr>
+        <w:t>为什么要和编译绑定？</w:t>
+      </w:r>
+    </w:p>
+  </w:comment>
+  <w:comment w:id="6" w:author="yangshangde" w:date="2018-09-12T11:37:00Z" w:initials="y">
+    <w:p>
+      <w:pPr>
+        <w:pStyle w:val="af0"/>
+      </w:pPr>
+      <w:r>
+        <w:rPr>
+          <w:rStyle w:val="af"/>
+        </w:rPr>
+        <w:annotationRef/>
+      </w:r>
+      <w:r>
+        <w:rPr>
+          <w:rFonts w:hint="eastAsia"/>
+        </w:rPr>
+        <w:t>描述不清晰，加图示或示例说明</w:t>
+      </w:r>
+    </w:p>
+  </w:comment>
+  <w:comment w:id="7" w:author="yangshangde" w:date="2018-09-12T11:31:00Z" w:initials="y">
+    <w:p>
+      <w:pPr>
+        <w:pStyle w:val="af0"/>
+        <w:ind w:left="0"/>
+      </w:pPr>
+      <w:r>
+        <w:rPr>
+          <w:rStyle w:val="af"/>
+        </w:rPr>
+        <w:annotationRef/>
+      </w:r>
+      <w:r>
+        <w:rPr>
+          <w:rFonts w:hint="eastAsia"/>
+        </w:rPr>
+        <w:t>用户输入的不是</w:t>
+      </w:r>
+      <w:r>
+        <w:rPr>
+          <w:rFonts w:hint="eastAsia"/>
+        </w:rPr>
+        <w:t xml:space="preserve"> token </w:t>
+      </w:r>
+      <w:r>
+        <w:rPr>
+          <w:rFonts w:hint="eastAsia"/>
+        </w:rPr>
+        <w:t>么？</w:t>
+      </w:r>
+    </w:p>
+  </w:comment>
+</w:comments>
+</file>
+
+<file path=word/commentsExtended.xml><?xml version="1.0" encoding="utf-8"?>
+<w15:commentsEx xmlns:wpc="http://schemas.microsoft.com/office/word/2010/wordprocessingCanvas" xmlns:cx="http://schemas.microsoft.com/office/drawing/2014/chartex" xmlns:mc="http://schemas.openxmlformats.org/markup-compatibility/2006" xmlns:o="urn:schemas-microsoft-com:office:office" xmlns:r="http://schemas.openxmlformats.org/officeDocument/2006/relationships" xmlns:m="http://schemas.openxmlformats.org/officeDocument/2006/math" xmlns:v="urn:schemas-microsoft-com:vml" xmlns:wp14="http://schemas.microsoft.com/office/word/2010/wordprocessingDrawing" xmlns:wp="http://schemas.openxmlformats.org/drawingml/2006/wordprocessingDrawing" xmlns:w10="urn:schemas-microsoft-com:office:word" xmlns:w="http://schemas.openxmlformats.org/wordprocessingml/2006/main" xmlns:w14="http://schemas.microsoft.com/office/word/2010/wordml" xmlns:w15="http://schemas.microsoft.com/office/word/2012/wordml" xmlns:w16se="http://schemas.microsoft.com/office/word/2015/wordml/symex" xmlns:wpg="http://schemas.microsoft.com/office/word/2010/wordprocessingGroup" xmlns:wpi="http://schemas.microsoft.com/office/word/2010/wordprocessingInk" xmlns:wne="http://schemas.microsoft.com/office/word/2006/wordml" xmlns:wps="http://schemas.microsoft.com/office/word/2010/wordprocessingShape" mc:Ignorable="w14 w15 w16se wp14">
+  <w15:commentEx w15:paraId="541FC53B" w15:done="0"/>
+  <w15:commentEx w15:paraId="3B15C671" w15:done="0"/>
+  <w15:commentEx w15:paraId="218CBAB8" w15:done="0"/>
+  <w15:commentEx w15:paraId="4BCC049D" w15:done="0"/>
+  <w15:commentEx w15:paraId="778D96A0" w15:done="0"/>
+  <w15:commentEx w15:paraId="6F8B4BA8" w15:done="0"/>
+  <w15:commentEx w15:paraId="546F550C" w15:done="0"/>
+  <w15:commentEx w15:paraId="6B4AA76E" w15:done="0"/>
+</w15:commentsEx>
 </file>
 
 <file path=word/endnotes.xml><?xml version="1.0" encoding="utf-8"?>
@@ -10402,6 +10609,14 @@
   </w:num>
   <w:numIdMacAtCleanup w:val="18"/>
 </w:numbering>
+</file>
+
+<file path=word/people.xml><?xml version="1.0" encoding="utf-8"?>
+<w15:people xmlns:wpc="http://schemas.microsoft.com/office/word/2010/wordprocessingCanvas" xmlns:cx="http://schemas.microsoft.com/office/drawing/2014/chartex" xmlns:mc="http://schemas.openxmlformats.org/markup-compatibility/2006" xmlns:o="urn:schemas-microsoft-com:office:office" xmlns:r="http://schemas.openxmlformats.org/officeDocument/2006/relationships" xmlns:m="http://schemas.openxmlformats.org/officeDocument/2006/math" xmlns:v="urn:schemas-microsoft-com:vml" xmlns:wp14="http://schemas.microsoft.com/office/word/2010/wordprocessingDrawing" xmlns:wp="http://schemas.openxmlformats.org/drawingml/2006/wordprocessingDrawing" xmlns:w10="urn:schemas-microsoft-com:office:word" xmlns:w="http://schemas.openxmlformats.org/wordprocessingml/2006/main" xmlns:w14="http://schemas.microsoft.com/office/word/2010/wordml" xmlns:w15="http://schemas.microsoft.com/office/word/2012/wordml" xmlns:w16se="http://schemas.microsoft.com/office/word/2015/wordml/symex" xmlns:wpg="http://schemas.microsoft.com/office/word/2010/wordprocessingGroup" xmlns:wpi="http://schemas.microsoft.com/office/word/2010/wordprocessingInk" xmlns:wne="http://schemas.microsoft.com/office/word/2006/wordml" xmlns:wps="http://schemas.microsoft.com/office/word/2010/wordprocessingShape" mc:Ignorable="w14 w15 w16se wp14">
+  <w15:person w15:author="yangshangde">
+    <w15:presenceInfo w15:providerId="None" w15:userId="yangshangde"/>
+  </w15:person>
+</w15:people>
 </file>
 
 <file path=word/styles.xml><?xml version="1.0" encoding="utf-8"?>
@@ -11520,7 +11735,7 @@
 </file>
 
 <file path=customXml/itemProps1.xml><?xml version="1.0" encoding="utf-8"?>
-<ds:datastoreItem xmlns:ds="http://schemas.openxmlformats.org/officeDocument/2006/customXml" ds:itemID="{9D37C248-966D-401D-8766-9C649FF4A048}">
+<ds:datastoreItem xmlns:ds="http://schemas.openxmlformats.org/officeDocument/2006/customXml" ds:itemID="{D908FA36-A7E4-4D14-980D-8650B7B15438}">
   <ds:schemaRefs>
     <ds:schemaRef ds:uri="http://schemas.openxmlformats.org/officeDocument/2006/bibliography"/>
   </ds:schemaRefs>

</xml_diff>

<commit_message>
SEQUOIADBMAINSTREAM-3623:【工具】新增交互式密码输入和加密文件两种方式 refactor some parts of cipherMgr
git-svn-id: http://192.168.20.11/sequoiadb/trunk@37608 6121f079-4a18-41d3-8c30-8870a322f2c2
</commit_message>
<xml_diff>
--- a/internal_doc/03.开发设计/Story-password调整方案.docx
+++ b/internal_doc/03.开发设计/Story-password调整方案.docx
@@ -5733,8 +5733,6 @@
           </w:pPr>
         </w:pPrChange>
       </w:pPr>
-      <w:bookmarkStart w:id="211" w:name="_GoBack"/>
-      <w:bookmarkEnd w:id="211"/>
     </w:p>
     <w:p>
       <w:pPr>
@@ -5757,7 +5755,7 @@
       <w:r>
         <w:t xml:space="preserve">fdw </w:t>
       </w:r>
-      <w:del w:id="212" w:author="zhaowenbo" w:date="2018-11-07T17:11:00Z">
+      <w:del w:id="211" w:author="zhaowenbo" w:date="2018-11-07T17:11:00Z">
         <w:r>
           <w:rPr>
             <w:rFonts w:hint="eastAsia"/>
@@ -5765,7 +5763,7 @@
           <w:delText>增加</w:delText>
         </w:r>
       </w:del>
-      <w:ins w:id="213" w:author="zhaowenbo" w:date="2018-11-07T17:11:00Z">
+      <w:ins w:id="212" w:author="zhaowenbo" w:date="2018-11-07T17:11:00Z">
         <w:r>
           <w:rPr>
             <w:rFonts w:hint="eastAsia"/>
@@ -5783,9 +5781,9 @@
     <w:p>
       <w:pPr>
         <w:rPr>
-          <w:ins w:id="214" w:author="zhaowenbo" w:date="2018-11-07T17:16:00Z"/>
-        </w:rPr>
-        <w:pPrChange w:id="215" w:author="zhaowenbo" w:date="2018-11-07T17:16:00Z">
+          <w:ins w:id="213" w:author="zhaowenbo" w:date="2018-11-07T17:16:00Z"/>
+        </w:rPr>
+        <w:pPrChange w:id="214" w:author="zhaowenbo" w:date="2018-11-07T17:16:00Z">
           <w:pPr>
             <w:pStyle w:val="aa"/>
             <w:numPr>
@@ -5795,7 +5793,7 @@
           </w:pPr>
         </w:pPrChange>
       </w:pPr>
-      <w:ins w:id="216" w:author="zhaowenbo" w:date="2018-11-07T17:16:00Z">
+      <w:ins w:id="215" w:author="zhaowenbo" w:date="2018-11-07T17:16:00Z">
         <w:r>
           <w:t>sdbConnectionHandle sdbGetConnectionHandle( const char **serverList,</w:t>
         </w:r>
@@ -5804,9 +5802,9 @@
     <w:p>
       <w:pPr>
         <w:rPr>
-          <w:ins w:id="217" w:author="zhaowenbo" w:date="2018-11-07T17:16:00Z"/>
-        </w:rPr>
-        <w:pPrChange w:id="218" w:author="zhaowenbo" w:date="2018-11-07T17:16:00Z">
+          <w:ins w:id="216" w:author="zhaowenbo" w:date="2018-11-07T17:16:00Z"/>
+        </w:rPr>
+        <w:pPrChange w:id="217" w:author="zhaowenbo" w:date="2018-11-07T17:16:00Z">
           <w:pPr>
             <w:pStyle w:val="aa"/>
             <w:numPr>
@@ -5816,7 +5814,7 @@
           </w:pPr>
         </w:pPrChange>
       </w:pPr>
-      <w:ins w:id="219" w:author="zhaowenbo" w:date="2018-11-07T17:16:00Z">
+      <w:ins w:id="218" w:author="zhaowenbo" w:date="2018-11-07T17:16:00Z">
         <w:r>
           <w:t xml:space="preserve">            </w:t>
         </w:r>
@@ -5831,9 +5829,9 @@
     <w:p>
       <w:pPr>
         <w:rPr>
-          <w:ins w:id="220" w:author="zhaowenbo" w:date="2018-11-07T17:16:00Z"/>
-        </w:rPr>
-        <w:pPrChange w:id="221" w:author="zhaowenbo" w:date="2018-11-07T17:16:00Z">
+          <w:ins w:id="219" w:author="zhaowenbo" w:date="2018-11-07T17:16:00Z"/>
+        </w:rPr>
+        <w:pPrChange w:id="220" w:author="zhaowenbo" w:date="2018-11-07T17:16:00Z">
           <w:pPr>
             <w:pStyle w:val="aa"/>
             <w:numPr>
@@ -5843,7 +5841,7 @@
           </w:pPr>
         </w:pPrChange>
       </w:pPr>
-      <w:ins w:id="222" w:author="zhaowenbo" w:date="2018-11-07T17:16:00Z">
+      <w:ins w:id="221" w:author="zhaowenbo" w:date="2018-11-07T17:16:00Z">
         <w:r>
           <w:t xml:space="preserve">            </w:t>
         </w:r>
@@ -5858,9 +5856,9 @@
     <w:p>
       <w:pPr>
         <w:rPr>
-          <w:ins w:id="223" w:author="zhaowenbo" w:date="2018-11-07T17:16:00Z"/>
-        </w:rPr>
-        <w:pPrChange w:id="224" w:author="zhaowenbo" w:date="2018-11-07T17:16:00Z">
+          <w:ins w:id="222" w:author="zhaowenbo" w:date="2018-11-07T17:16:00Z"/>
+        </w:rPr>
+        <w:pPrChange w:id="223" w:author="zhaowenbo" w:date="2018-11-07T17:16:00Z">
           <w:pPr>
             <w:pStyle w:val="aa"/>
             <w:numPr>
@@ -5870,7 +5868,7 @@
           </w:pPr>
         </w:pPrChange>
       </w:pPr>
-      <w:ins w:id="225" w:author="zhaowenbo" w:date="2018-11-07T17:16:00Z">
+      <w:ins w:id="224" w:author="zhaowenbo" w:date="2018-11-07T17:16:00Z">
         <w:r>
           <w:t xml:space="preserve">         </w:t>
         </w:r>
@@ -5885,9 +5883,9 @@
     <w:p>
       <w:pPr>
         <w:rPr>
-          <w:ins w:id="226" w:author="zhaowenbo" w:date="2018-11-07T17:16:00Z"/>
-        </w:rPr>
-        <w:pPrChange w:id="227" w:author="zhaowenbo" w:date="2018-11-07T17:16:00Z">
+          <w:ins w:id="225" w:author="zhaowenbo" w:date="2018-11-07T17:16:00Z"/>
+        </w:rPr>
+        <w:pPrChange w:id="226" w:author="zhaowenbo" w:date="2018-11-07T17:16:00Z">
           <w:pPr>
             <w:pStyle w:val="aa"/>
             <w:numPr>
@@ -5897,7 +5895,7 @@
           </w:pPr>
         </w:pPrChange>
       </w:pPr>
-      <w:ins w:id="228" w:author="zhaowenbo" w:date="2018-11-07T17:16:00Z">
+      <w:ins w:id="227" w:author="zhaowenbo" w:date="2018-11-07T17:16:00Z">
         <w:r>
           <w:t xml:space="preserve">      </w:t>
         </w:r>
@@ -5912,9 +5910,9 @@
     <w:p>
       <w:pPr>
         <w:rPr>
-          <w:ins w:id="229" w:author="zhaowenbo" w:date="2018-11-07T17:16:00Z"/>
-        </w:rPr>
-        <w:pPrChange w:id="230" w:author="zhaowenbo" w:date="2018-11-07T17:16:00Z">
+          <w:ins w:id="228" w:author="zhaowenbo" w:date="2018-11-07T17:16:00Z"/>
+        </w:rPr>
+        <w:pPrChange w:id="229" w:author="zhaowenbo" w:date="2018-11-07T17:16:00Z">
           <w:pPr>
             <w:pStyle w:val="aa"/>
             <w:numPr>
@@ -5924,7 +5922,7 @@
           </w:pPr>
         </w:pPrChange>
       </w:pPr>
-      <w:ins w:id="231" w:author="zhaowenbo" w:date="2018-11-07T17:16:00Z">
+      <w:ins w:id="230" w:author="zhaowenbo" w:date="2018-11-07T17:16:00Z">
         <w:r>
           <w:t xml:space="preserve">   </w:t>
         </w:r>
@@ -5939,9 +5937,9 @@
     <w:p>
       <w:pPr>
         <w:rPr>
-          <w:ins w:id="232" w:author="zhaowenbo" w:date="2018-11-07T17:16:00Z"/>
-        </w:rPr>
-        <w:pPrChange w:id="233" w:author="zhaowenbo" w:date="2018-11-07T17:16:00Z">
+          <w:ins w:id="231" w:author="zhaowenbo" w:date="2018-11-07T17:16:00Z"/>
+        </w:rPr>
+        <w:pPrChange w:id="232" w:author="zhaowenbo" w:date="2018-11-07T17:16:00Z">
           <w:pPr>
             <w:pStyle w:val="aa"/>
             <w:numPr>
@@ -5951,7 +5949,7 @@
           </w:pPr>
         </w:pPrChange>
       </w:pPr>
-      <w:ins w:id="234" w:author="zhaowenbo" w:date="2018-11-07T17:16:00Z">
+      <w:ins w:id="233" w:author="zhaowenbo" w:date="2018-11-07T17:16:00Z">
         <w:r>
           <w:t xml:space="preserve">                             </w:t>
         </w:r>
@@ -5963,9 +5961,9 @@
     <w:p>
       <w:pPr>
         <w:rPr>
-          <w:ins w:id="235" w:author="zhaowenbo" w:date="2018-11-07T17:16:00Z"/>
-        </w:rPr>
-        <w:pPrChange w:id="236" w:author="zhaowenbo" w:date="2018-11-07T17:16:00Z">
+          <w:ins w:id="234" w:author="zhaowenbo" w:date="2018-11-07T17:16:00Z"/>
+        </w:rPr>
+        <w:pPrChange w:id="235" w:author="zhaowenbo" w:date="2018-11-07T17:16:00Z">
           <w:pPr>
             <w:pStyle w:val="aa"/>
             <w:numPr>
@@ -5975,7 +5973,7 @@
           </w:pPr>
         </w:pPrChange>
       </w:pPr>
-      <w:ins w:id="237" w:author="zhaowenbo" w:date="2018-11-07T17:16:00Z">
+      <w:ins w:id="236" w:author="zhaowenbo" w:date="2018-11-07T17:16:00Z">
         <w:r>
           <w:t xml:space="preserve">                          </w:t>
         </w:r>
@@ -5987,9 +5985,9 @@
     <w:p>
       <w:pPr>
         <w:rPr>
-          <w:ins w:id="238" w:author="zhaowenbo" w:date="2018-11-07T17:16:00Z"/>
-        </w:rPr>
-        <w:pPrChange w:id="239" w:author="zhaowenbo" w:date="2018-11-07T17:16:00Z">
+          <w:ins w:id="237" w:author="zhaowenbo" w:date="2018-11-07T17:16:00Z"/>
+        </w:rPr>
+        <w:pPrChange w:id="238" w:author="zhaowenbo" w:date="2018-11-07T17:16:00Z">
           <w:pPr>
             <w:pStyle w:val="aa"/>
             <w:numPr>
@@ -5999,7 +5997,7 @@
           </w:pPr>
         </w:pPrChange>
       </w:pPr>
-      <w:ins w:id="240" w:author="zhaowenbo" w:date="2018-11-07T17:16:00Z">
+      <w:ins w:id="239" w:author="zhaowenbo" w:date="2018-11-07T17:16:00Z">
         <w:r>
           <w:t xml:space="preserve">                       </w:t>
         </w:r>
@@ -6011,9 +6009,9 @@
     <w:p>
       <w:pPr>
         <w:rPr>
-          <w:ins w:id="241" w:author="zhaowenbo" w:date="2018-11-07T17:16:00Z"/>
-        </w:rPr>
-        <w:pPrChange w:id="242" w:author="zhaowenbo" w:date="2018-11-07T17:16:00Z">
+          <w:ins w:id="240" w:author="zhaowenbo" w:date="2018-11-07T17:16:00Z"/>
+        </w:rPr>
+        <w:pPrChange w:id="241" w:author="zhaowenbo" w:date="2018-11-07T17:16:00Z">
           <w:pPr>
             <w:pStyle w:val="aa"/>
             <w:numPr>
@@ -6023,7 +6021,7 @@
           </w:pPr>
         </w:pPrChange>
       </w:pPr>
-      <w:ins w:id="243" w:author="zhaowenbo" w:date="2018-11-07T17:16:00Z">
+      <w:ins w:id="242" w:author="zhaowenbo" w:date="2018-11-07T17:16:00Z">
         <w:r>
           <w:t xml:space="preserve">                    </w:t>
         </w:r>
@@ -6039,10 +6037,10 @@
           <w:numId w:val="5"/>
         </w:numPr>
         <w:rPr>
-          <w:del w:id="244" w:author="zhaowenbo" w:date="2018-11-07T17:16:00Z"/>
-        </w:rPr>
-      </w:pPr>
-      <w:ins w:id="245" w:author="zhaowenbo" w:date="2018-11-07T17:16:00Z">
+          <w:del w:id="243" w:author="zhaowenbo" w:date="2018-11-07T17:16:00Z"/>
+        </w:rPr>
+      </w:pPr>
+      <w:ins w:id="244" w:author="zhaowenbo" w:date="2018-11-07T17:16:00Z">
         <w:r>
           <w:t xml:space="preserve">         </w:t>
         </w:r>
@@ -6050,7 +6048,7 @@
           <w:t xml:space="preserve">                            const char *transaction )</w:t>
         </w:r>
       </w:ins>
-      <w:del w:id="246" w:author="zhaowenbo" w:date="2018-11-07T17:16:00Z">
+      <w:del w:id="245" w:author="zhaowenbo" w:date="2018-11-07T17:16:00Z">
         <w:r>
           <w:delText>sdbConnectionHandle sdbGetConnectionHandle</w:delText>
         </w:r>
@@ -6067,10 +6065,10 @@
         <w:pStyle w:val="aa"/>
         <w:ind w:left="777"/>
         <w:rPr>
-          <w:del w:id="247" w:author="zhaowenbo" w:date="2018-11-07T17:16:00Z"/>
-        </w:rPr>
-      </w:pPr>
-      <w:del w:id="248" w:author="zhaowenbo" w:date="2018-11-07T17:16:00Z">
+          <w:del w:id="246" w:author="zhaowenbo" w:date="2018-11-07T17:16:00Z"/>
+        </w:rPr>
+      </w:pPr>
+      <w:del w:id="247" w:author="zhaowenbo" w:date="2018-11-07T17:16:00Z">
         <w:r>
           <w:delText xml:space="preserve">                                        int serverNum,</w:delText>
         </w:r>
@@ -6081,10 +6079,10 @@
         <w:pStyle w:val="aa"/>
         <w:ind w:left="777"/>
         <w:rPr>
-          <w:del w:id="249" w:author="zhaowenbo" w:date="2018-11-07T17:16:00Z"/>
-        </w:rPr>
-      </w:pPr>
-      <w:del w:id="250" w:author="zhaowenbo" w:date="2018-11-07T17:16:00Z">
+          <w:del w:id="248" w:author="zhaowenbo" w:date="2018-11-07T17:16:00Z"/>
+        </w:rPr>
+      </w:pPr>
+      <w:del w:id="249" w:author="zhaowenbo" w:date="2018-11-07T17:16:00Z">
         <w:r>
           <w:delText xml:space="preserve">                                        const char *usr,</w:delText>
         </w:r>
@@ -6095,10 +6093,10 @@
         <w:pStyle w:val="aa"/>
         <w:ind w:left="777"/>
         <w:rPr>
-          <w:del w:id="251" w:author="zhaowenbo" w:date="2018-11-07T17:16:00Z"/>
-        </w:rPr>
-      </w:pPr>
-      <w:del w:id="252" w:author="zhaowenbo" w:date="2018-11-07T17:16:00Z">
+          <w:del w:id="250" w:author="zhaowenbo" w:date="2018-11-07T17:16:00Z"/>
+        </w:rPr>
+      </w:pPr>
+      <w:del w:id="251" w:author="zhaowenbo" w:date="2018-11-07T17:16:00Z">
         <w:r>
           <w:delText xml:space="preserve">                                       </w:delText>
         </w:r>
@@ -6118,10 +6116,10 @@
         <w:pStyle w:val="aa"/>
         <w:ind w:left="777"/>
         <w:rPr>
-          <w:del w:id="253" w:author="zhaowenbo" w:date="2018-11-07T17:16:00Z"/>
-        </w:rPr>
-      </w:pPr>
-      <w:del w:id="254" w:author="zhaowenbo" w:date="2018-11-07T17:16:00Z">
+          <w:del w:id="252" w:author="zhaowenbo" w:date="2018-11-07T17:16:00Z"/>
+        </w:rPr>
+      </w:pPr>
+      <w:del w:id="253" w:author="zhaowenbo" w:date="2018-11-07T17:16:00Z">
         <w:r>
           <w:delText xml:space="preserve">                                        const char *token,</w:delText>
         </w:r>
@@ -6132,10 +6130,10 @@
         <w:pStyle w:val="aa"/>
         <w:ind w:left="777"/>
         <w:rPr>
-          <w:del w:id="255" w:author="zhaowenbo" w:date="2018-11-07T17:16:00Z"/>
-        </w:rPr>
-      </w:pPr>
-      <w:del w:id="256" w:author="zhaowenbo" w:date="2018-11-07T17:16:00Z">
+          <w:del w:id="254" w:author="zhaowenbo" w:date="2018-11-07T17:16:00Z"/>
+        </w:rPr>
+      </w:pPr>
+      <w:del w:id="255" w:author="zhaowenbo" w:date="2018-11-07T17:16:00Z">
         <w:r>
           <w:tab/>
         </w:r>
@@ -6180,10 +6178,10 @@
         <w:pStyle w:val="aa"/>
         <w:ind w:left="777"/>
         <w:rPr>
-          <w:del w:id="257" w:author="zhaowenbo" w:date="2018-11-07T17:16:00Z"/>
-        </w:rPr>
-      </w:pPr>
-      <w:del w:id="258" w:author="zhaowenbo" w:date="2018-11-07T17:16:00Z">
+          <w:del w:id="256" w:author="zhaowenbo" w:date="2018-11-07T17:16:00Z"/>
+        </w:rPr>
+      </w:pPr>
+      <w:del w:id="257" w:author="zhaowenbo" w:date="2018-11-07T17:16:00Z">
         <w:r>
           <w:delText xml:space="preserve">                                        const char *preference_instance,</w:delText>
         </w:r>
@@ -6194,10 +6192,10 @@
         <w:pStyle w:val="aa"/>
         <w:ind w:left="777"/>
         <w:rPr>
-          <w:del w:id="259" w:author="zhaowenbo" w:date="2018-11-07T17:16:00Z"/>
-        </w:rPr>
-      </w:pPr>
-      <w:del w:id="260" w:author="zhaowenbo" w:date="2018-11-07T17:16:00Z">
+          <w:del w:id="258" w:author="zhaowenbo" w:date="2018-11-07T17:16:00Z"/>
+        </w:rPr>
+      </w:pPr>
+      <w:del w:id="259" w:author="zhaowenbo" w:date="2018-11-07T17:16:00Z">
         <w:r>
           <w:delText xml:space="preserve">                                        const char *preference_instance_mode,</w:delText>
         </w:r>
@@ -6208,10 +6206,10 @@
         <w:pStyle w:val="aa"/>
         <w:ind w:left="777"/>
         <w:rPr>
-          <w:del w:id="261" w:author="zhaowenbo" w:date="2018-11-07T17:16:00Z"/>
-        </w:rPr>
-      </w:pPr>
-      <w:del w:id="262" w:author="zhaowenbo" w:date="2018-11-07T17:16:00Z">
+          <w:del w:id="260" w:author="zhaowenbo" w:date="2018-11-07T17:16:00Z"/>
+        </w:rPr>
+      </w:pPr>
+      <w:del w:id="261" w:author="zhaowenbo" w:date="2018-11-07T17:16:00Z">
         <w:r>
           <w:delText xml:space="preserve">                                        int session_timeout,</w:delText>
         </w:r>
@@ -6222,10 +6220,10 @@
         <w:pStyle w:val="aa"/>
         <w:ind w:left="777" w:firstLineChars="0" w:firstLine="0"/>
         <w:rPr>
-          <w:del w:id="263" w:author="zhaowenbo" w:date="2018-11-07T17:16:00Z"/>
-        </w:rPr>
-      </w:pPr>
-      <w:del w:id="264" w:author="zhaowenbo" w:date="2018-11-07T17:16:00Z">
+          <w:del w:id="262" w:author="zhaowenbo" w:date="2018-11-07T17:16:00Z"/>
+        </w:rPr>
+      </w:pPr>
+      <w:del w:id="263" w:author="zhaowenbo" w:date="2018-11-07T17:16:00Z">
         <w:r>
           <w:delText xml:space="preserve">                                            const char *transaction )</w:delText>
         </w:r>
@@ -6260,156 +6258,156 @@
         </w:rPr>
         <w:t xml:space="preserve"> </w:t>
       </w:r>
+      <w:ins w:id="264" w:author="zhaowenbo" w:date="2018-11-07T17:16:00Z">
+        <w:r>
+          <w:t>useCipher</w:t>
+        </w:r>
+        <w:r>
+          <w:rPr>
+            <w:rFonts w:hint="eastAsia"/>
+          </w:rPr>
+          <w:t xml:space="preserve"> </w:t>
+        </w:r>
+        <w:r>
+          <w:rPr>
+            <w:rFonts w:hint="eastAsia"/>
+          </w:rPr>
+          <w:t>、</w:t>
+        </w:r>
+      </w:ins>
+      <w:r>
+        <w:rPr>
+          <w:rFonts w:hint="eastAsia"/>
+        </w:rPr>
+        <w:t>cipher</w:t>
+      </w:r>
       <w:ins w:id="265" w:author="zhaowenbo" w:date="2018-11-07T17:16:00Z">
         <w:r>
-          <w:t>useCipher</w:t>
-        </w:r>
-        <w:r>
-          <w:rPr>
-            <w:rFonts w:hint="eastAsia"/>
-          </w:rPr>
-          <w:t xml:space="preserve"> </w:t>
-        </w:r>
-        <w:r>
-          <w:rPr>
-            <w:rFonts w:hint="eastAsia"/>
-          </w:rPr>
-          <w:t>、</w:t>
+          <w:rPr>
+            <w:rFonts w:hint="eastAsia"/>
+          </w:rPr>
+          <w:t>file</w:t>
         </w:r>
       </w:ins>
-      <w:r>
-        <w:rPr>
-          <w:rFonts w:hint="eastAsia"/>
-        </w:rPr>
-        <w:t>cipher</w:t>
-      </w:r>
-      <w:ins w:id="266" w:author="zhaowenbo" w:date="2018-11-07T17:16:00Z">
-        <w:r>
-          <w:rPr>
-            <w:rFonts w:hint="eastAsia"/>
-          </w:rPr>
-          <w:t>file</w:t>
+      <w:del w:id="266" w:author="zhaowenbo" w:date="2018-11-07T17:16:00Z">
+        <w:r>
+          <w:rPr>
+            <w:rFonts w:hint="eastAsia"/>
+          </w:rPr>
+          <w:delText>File</w:delText>
+        </w:r>
+        <w:r>
+          <w:rPr>
+            <w:rFonts w:hint="eastAsia"/>
+          </w:rPr>
+          <w:delText>、</w:delText>
+        </w:r>
+        <w:r>
+          <w:delText>cluster</w:delText>
+        </w:r>
+      </w:del>
+      <w:r>
+        <w:rPr>
+          <w:rFonts w:hint="eastAsia"/>
+        </w:rPr>
+        <w:t>和</w:t>
+      </w:r>
+      <w:r>
+        <w:rPr>
+          <w:rFonts w:hint="eastAsia"/>
+        </w:rPr>
+        <w:t>token</w:t>
+      </w:r>
+      <w:r>
+        <w:rPr>
+          <w:rFonts w:hint="eastAsia"/>
+        </w:rPr>
+        <w:t>，</w:t>
+      </w:r>
+      <w:del w:id="267" w:author="zhaowenbo" w:date="2018-11-07T17:17:00Z">
+        <w:r>
+          <w:rPr>
+            <w:rFonts w:hint="eastAsia"/>
+          </w:rPr>
+          <w:delText>用于传入加密文件需要的参数</w:delText>
+        </w:r>
+      </w:del>
+      <w:ins w:id="268" w:author="zhaowenbo" w:date="2018-11-07T17:17:00Z">
+        <w:r>
+          <w:rPr>
+            <w:rFonts w:hint="eastAsia"/>
+          </w:rPr>
+          <w:t>根据</w:t>
+        </w:r>
+        <w:r>
+          <w:rPr>
+            <w:rFonts w:hint="eastAsia"/>
+          </w:rPr>
+          <w:t xml:space="preserve"> userCipher </w:t>
+        </w:r>
+        <w:r>
+          <w:rPr>
+            <w:rFonts w:hint="eastAsia"/>
+          </w:rPr>
+          <w:t>判断是否使用加密文件，若使用</w:t>
         </w:r>
       </w:ins>
-      <w:del w:id="267" w:author="zhaowenbo" w:date="2018-11-07T17:16:00Z">
-        <w:r>
-          <w:rPr>
-            <w:rFonts w:hint="eastAsia"/>
-          </w:rPr>
-          <w:delText>File</w:delText>
-        </w:r>
-        <w:r>
-          <w:rPr>
-            <w:rFonts w:hint="eastAsia"/>
-          </w:rPr>
-          <w:delText>、</w:delText>
-        </w:r>
-        <w:r>
-          <w:delText>cluster</w:delText>
+      <w:ins w:id="269" w:author="zhaowenbo" w:date="2018-11-07T17:36:00Z">
+        <w:r>
+          <w:rPr>
+            <w:rFonts w:hint="eastAsia"/>
+          </w:rPr>
+          <w:t>，</w:t>
+        </w:r>
+      </w:ins>
+      <w:ins w:id="270" w:author="zhaowenbo" w:date="2018-11-07T17:17:00Z">
+        <w:r>
+          <w:rPr>
+            <w:rFonts w:hint="eastAsia"/>
+          </w:rPr>
+          <w:t>则通过</w:t>
+        </w:r>
+        <w:r>
+          <w:t>sdbGetPasswdByCipherFile</w:t>
+        </w:r>
+        <w:r>
+          <w:rPr>
+            <w:rFonts w:hint="eastAsia"/>
+          </w:rPr>
+          <w:t>获取解密</w:t>
+        </w:r>
+      </w:ins>
+      <w:ins w:id="271" w:author="zhaowenbo" w:date="2018-11-07T17:18:00Z">
+        <w:r>
+          <w:rPr>
+            <w:rFonts w:hint="eastAsia"/>
+          </w:rPr>
+          <w:t>密码，</w:t>
+        </w:r>
+      </w:ins>
+      <w:del w:id="272" w:author="zhaowenbo" w:date="2018-11-07T17:18:00Z">
+        <w:r>
+          <w:rPr>
+            <w:rFonts w:hint="eastAsia"/>
+          </w:rPr>
+          <w:delText>。</w:delText>
         </w:r>
       </w:del>
-      <w:r>
-        <w:rPr>
-          <w:rFonts w:hint="eastAsia"/>
-        </w:rPr>
-        <w:t>和</w:t>
-      </w:r>
-      <w:r>
-        <w:rPr>
-          <w:rFonts w:hint="eastAsia"/>
-        </w:rPr>
-        <w:t>token</w:t>
-      </w:r>
-      <w:r>
-        <w:rPr>
-          <w:rFonts w:hint="eastAsia"/>
-        </w:rPr>
-        <w:t>，</w:t>
-      </w:r>
-      <w:del w:id="268" w:author="zhaowenbo" w:date="2018-11-07T17:17:00Z">
-        <w:r>
-          <w:rPr>
-            <w:rFonts w:hint="eastAsia"/>
-          </w:rPr>
-          <w:delText>用于传入加密文件需要的参数</w:delText>
-        </w:r>
-      </w:del>
-      <w:ins w:id="269" w:author="zhaowenbo" w:date="2018-11-07T17:17:00Z">
-        <w:r>
-          <w:rPr>
-            <w:rFonts w:hint="eastAsia"/>
-          </w:rPr>
-          <w:t>根据</w:t>
-        </w:r>
-        <w:r>
-          <w:rPr>
-            <w:rFonts w:hint="eastAsia"/>
-          </w:rPr>
-          <w:t xml:space="preserve"> userCipher </w:t>
-        </w:r>
-        <w:r>
-          <w:rPr>
-            <w:rFonts w:hint="eastAsia"/>
-          </w:rPr>
-          <w:t>判断是否使用加密文件，若使用</w:t>
+      <w:ins w:id="273" w:author="zhaowenbo" w:date="2018-11-07T17:18:00Z">
+        <w:r>
+          <w:rPr>
+            <w:rFonts w:hint="eastAsia"/>
+          </w:rPr>
+          <w:t>然后连接</w:t>
+        </w:r>
+        <w:r>
+          <w:rPr>
+            <w:rFonts w:hint="eastAsia"/>
+          </w:rPr>
+          <w:t xml:space="preserve"> sdb</w:t>
         </w:r>
       </w:ins>
-      <w:ins w:id="270" w:author="zhaowenbo" w:date="2018-11-07T17:36:00Z">
-        <w:r>
-          <w:rPr>
-            <w:rFonts w:hint="eastAsia"/>
-          </w:rPr>
-          <w:t>，</w:t>
-        </w:r>
-      </w:ins>
-      <w:ins w:id="271" w:author="zhaowenbo" w:date="2018-11-07T17:17:00Z">
-        <w:r>
-          <w:rPr>
-            <w:rFonts w:hint="eastAsia"/>
-          </w:rPr>
-          <w:t>则通过</w:t>
-        </w:r>
-        <w:r>
-          <w:t>sdbGetPasswdByCipherFile</w:t>
-        </w:r>
-        <w:r>
-          <w:rPr>
-            <w:rFonts w:hint="eastAsia"/>
-          </w:rPr>
-          <w:t>获取解密</w:t>
-        </w:r>
-      </w:ins>
-      <w:ins w:id="272" w:author="zhaowenbo" w:date="2018-11-07T17:18:00Z">
-        <w:r>
-          <w:rPr>
-            <w:rFonts w:hint="eastAsia"/>
-          </w:rPr>
-          <w:t>密码，</w:t>
-        </w:r>
-      </w:ins>
-      <w:del w:id="273" w:author="zhaowenbo" w:date="2018-11-07T17:18:00Z">
-        <w:r>
-          <w:rPr>
-            <w:rFonts w:hint="eastAsia"/>
-          </w:rPr>
-          <w:delText>。</w:delText>
-        </w:r>
-      </w:del>
-      <w:ins w:id="274" w:author="zhaowenbo" w:date="2018-11-07T17:18:00Z">
-        <w:r>
-          <w:rPr>
-            <w:rFonts w:hint="eastAsia"/>
-          </w:rPr>
-          <w:t>然后连接</w:t>
-        </w:r>
-        <w:r>
-          <w:rPr>
-            <w:rFonts w:hint="eastAsia"/>
-          </w:rPr>
-          <w:t xml:space="preserve"> sdb</w:t>
-        </w:r>
-      </w:ins>
-      <w:del w:id="275" w:author="zhaowenbo" w:date="2018-11-07T17:18:00Z">
+      <w:del w:id="274" w:author="zhaowenbo" w:date="2018-11-07T17:18:00Z">
         <w:r>
           <w:rPr>
             <w:rFonts w:hint="eastAsia"/>
@@ -6486,7 +6484,7 @@
         <w:tblW w:w="0" w:type="auto"/>
         <w:tblInd w:w="357" w:type="dxa"/>
         <w:tblLook w:val="04A0" w:firstRow="1" w:lastRow="0" w:firstColumn="1" w:lastColumn="0" w:noHBand="0" w:noVBand="1"/>
-        <w:tblPrChange w:id="276" w:author="zhaowenbo" w:date="2018-11-07T17:20:00Z">
+        <w:tblPrChange w:id="275" w:author="zhaowenbo" w:date="2018-11-07T17:20:00Z">
           <w:tblPr>
             <w:tblStyle w:val="a9"/>
             <w:tblW w:w="0" w:type="auto"/>
@@ -6500,7 +6498,7 @@
         <w:gridCol w:w="5436"/>
         <w:gridCol w:w="4025"/>
         <w:gridCol w:w="1613"/>
-        <w:tblGridChange w:id="277">
+        <w:tblGridChange w:id="276">
           <w:tblGrid>
             <w:gridCol w:w="1996"/>
             <w:gridCol w:w="5039"/>
@@ -6513,7 +6511,7 @@
         <w:tc>
           <w:tcPr>
             <w:tcW w:w="1996" w:type="dxa"/>
-            <w:tcPrChange w:id="278" w:author="zhaowenbo" w:date="2018-11-07T17:20:00Z">
+            <w:tcPrChange w:id="277" w:author="zhaowenbo" w:date="2018-11-07T17:20:00Z">
               <w:tcPr>
                 <w:tcW w:w="2840" w:type="dxa"/>
               </w:tcPr>
@@ -6534,7 +6532,7 @@
         <w:tc>
           <w:tcPr>
             <w:tcW w:w="5436" w:type="dxa"/>
-            <w:tcPrChange w:id="279" w:author="zhaowenbo" w:date="2018-11-07T17:20:00Z">
+            <w:tcPrChange w:id="278" w:author="zhaowenbo" w:date="2018-11-07T17:20:00Z">
               <w:tcPr>
                 <w:tcW w:w="5584" w:type="dxa"/>
               </w:tcPr>
@@ -6555,7 +6553,7 @@
         <w:tc>
           <w:tcPr>
             <w:tcW w:w="4025" w:type="dxa"/>
-            <w:tcPrChange w:id="280" w:author="zhaowenbo" w:date="2018-11-07T17:20:00Z">
+            <w:tcPrChange w:id="279" w:author="zhaowenbo" w:date="2018-11-07T17:20:00Z">
               <w:tcPr>
                 <w:tcW w:w="5812" w:type="dxa"/>
               </w:tcPr>
@@ -6576,7 +6574,7 @@
         <w:tc>
           <w:tcPr>
             <w:tcW w:w="1613" w:type="dxa"/>
-            <w:tcPrChange w:id="281" w:author="zhaowenbo" w:date="2018-11-07T17:20:00Z">
+            <w:tcPrChange w:id="280" w:author="zhaowenbo" w:date="2018-11-07T17:20:00Z">
               <w:tcPr>
                 <w:tcW w:w="1417" w:type="dxa"/>
               </w:tcPr>
@@ -6597,12 +6595,12 @@
       </w:tr>
       <w:tr>
         <w:trPr>
-          <w:del w:id="282" w:author="zhaowenbo" w:date="2018-11-07T17:21:00Z"/>
+          <w:del w:id="281" w:author="zhaowenbo" w:date="2018-11-07T17:21:00Z"/>
         </w:trPr>
         <w:tc>
           <w:tcPr>
             <w:tcW w:w="1996" w:type="dxa"/>
-            <w:tcPrChange w:id="283" w:author="zhaowenbo" w:date="2018-11-07T17:20:00Z">
+            <w:tcPrChange w:id="282" w:author="zhaowenbo" w:date="2018-11-07T17:20:00Z">
               <w:tcPr>
                 <w:tcW w:w="2840" w:type="dxa"/>
               </w:tcPr>
@@ -6612,10 +6610,10 @@
             <w:pPr>
               <w:ind w:left="0"/>
               <w:rPr>
-                <w:del w:id="284" w:author="zhaowenbo" w:date="2018-11-07T17:21:00Z"/>
-              </w:rPr>
-            </w:pPr>
-            <w:del w:id="285" w:author="zhaowenbo" w:date="2018-11-07T17:21:00Z">
+                <w:del w:id="283" w:author="zhaowenbo" w:date="2018-11-07T17:21:00Z"/>
+              </w:rPr>
+            </w:pPr>
+            <w:del w:id="284" w:author="zhaowenbo" w:date="2018-11-07T17:21:00Z">
               <w:r>
                 <w:rPr>
                   <w:rFonts w:hint="eastAsia"/>
@@ -6628,7 +6626,7 @@
         <w:tc>
           <w:tcPr>
             <w:tcW w:w="5436" w:type="dxa"/>
-            <w:tcPrChange w:id="286" w:author="zhaowenbo" w:date="2018-11-07T17:20:00Z">
+            <w:tcPrChange w:id="285" w:author="zhaowenbo" w:date="2018-11-07T17:20:00Z">
               <w:tcPr>
                 <w:tcW w:w="5584" w:type="dxa"/>
               </w:tcPr>
@@ -6638,10 +6636,10 @@
             <w:pPr>
               <w:ind w:left="0"/>
               <w:rPr>
-                <w:del w:id="287" w:author="zhaowenbo" w:date="2018-11-07T17:21:00Z"/>
-              </w:rPr>
-            </w:pPr>
-            <w:del w:id="288" w:author="zhaowenbo" w:date="2018-11-07T17:21:00Z">
+                <w:del w:id="286" w:author="zhaowenbo" w:date="2018-11-07T17:21:00Z"/>
+              </w:rPr>
+            </w:pPr>
+            <w:del w:id="287" w:author="zhaowenbo" w:date="2018-11-07T17:21:00Z">
               <w:r>
                 <w:rPr>
                   <w:rFonts w:hint="eastAsia"/>
@@ -6654,7 +6652,7 @@
         <w:tc>
           <w:tcPr>
             <w:tcW w:w="4025" w:type="dxa"/>
-            <w:tcPrChange w:id="289" w:author="zhaowenbo" w:date="2018-11-07T17:20:00Z">
+            <w:tcPrChange w:id="288" w:author="zhaowenbo" w:date="2018-11-07T17:20:00Z">
               <w:tcPr>
                 <w:tcW w:w="5812" w:type="dxa"/>
               </w:tcPr>
@@ -6664,10 +6662,10 @@
             <w:pPr>
               <w:ind w:left="0"/>
               <w:rPr>
-                <w:del w:id="290" w:author="zhaowenbo" w:date="2018-11-07T17:21:00Z"/>
-              </w:rPr>
-            </w:pPr>
-            <w:del w:id="291" w:author="zhaowenbo" w:date="2018-11-07T17:21:00Z">
+                <w:del w:id="289" w:author="zhaowenbo" w:date="2018-11-07T17:21:00Z"/>
+              </w:rPr>
+            </w:pPr>
+            <w:del w:id="290" w:author="zhaowenbo" w:date="2018-11-07T17:21:00Z">
               <w:r>
                 <w:rPr>
                   <w:rFonts w:hint="eastAsia"/>
@@ -6704,7 +6702,7 @@
         <w:tc>
           <w:tcPr>
             <w:tcW w:w="1613" w:type="dxa"/>
-            <w:tcPrChange w:id="292" w:author="zhaowenbo" w:date="2018-11-07T17:20:00Z">
+            <w:tcPrChange w:id="291" w:author="zhaowenbo" w:date="2018-11-07T17:20:00Z">
               <w:tcPr>
                 <w:tcW w:w="1417" w:type="dxa"/>
               </w:tcPr>
@@ -6714,10 +6712,10 @@
             <w:pPr>
               <w:ind w:left="0"/>
               <w:rPr>
-                <w:del w:id="293" w:author="zhaowenbo" w:date="2018-11-07T17:21:00Z"/>
-              </w:rPr>
-            </w:pPr>
-            <w:del w:id="294" w:author="zhaowenbo" w:date="2018-11-07T17:21:00Z">
+                <w:del w:id="292" w:author="zhaowenbo" w:date="2018-11-07T17:21:00Z"/>
+              </w:rPr>
+            </w:pPr>
+            <w:del w:id="293" w:author="zhaowenbo" w:date="2018-11-07T17:21:00Z">
               <w:r>
                 <w:rPr>
                   <w:rFonts w:hint="eastAsia"/>
@@ -6730,12 +6728,12 @@
       </w:tr>
       <w:tr>
         <w:trPr>
-          <w:del w:id="295" w:author="zhaowenbo" w:date="2018-11-07T17:21:00Z"/>
+          <w:del w:id="294" w:author="zhaowenbo" w:date="2018-11-07T17:21:00Z"/>
         </w:trPr>
         <w:tc>
           <w:tcPr>
             <w:tcW w:w="1996" w:type="dxa"/>
-            <w:tcPrChange w:id="296" w:author="zhaowenbo" w:date="2018-11-07T17:20:00Z">
+            <w:tcPrChange w:id="295" w:author="zhaowenbo" w:date="2018-11-07T17:20:00Z">
               <w:tcPr>
                 <w:tcW w:w="2840" w:type="dxa"/>
               </w:tcPr>
@@ -6745,10 +6743,10 @@
             <w:pPr>
               <w:ind w:left="0"/>
               <w:rPr>
-                <w:del w:id="297" w:author="zhaowenbo" w:date="2018-11-07T17:21:00Z"/>
-              </w:rPr>
-            </w:pPr>
-            <w:del w:id="298" w:author="zhaowenbo" w:date="2018-11-07T17:21:00Z">
+                <w:del w:id="296" w:author="zhaowenbo" w:date="2018-11-07T17:21:00Z"/>
+              </w:rPr>
+            </w:pPr>
+            <w:del w:id="297" w:author="zhaowenbo" w:date="2018-11-07T17:21:00Z">
               <w:r>
                 <w:rPr>
                   <w:rFonts w:hint="eastAsia"/>
@@ -6761,7 +6759,7 @@
         <w:tc>
           <w:tcPr>
             <w:tcW w:w="5436" w:type="dxa"/>
-            <w:tcPrChange w:id="299" w:author="zhaowenbo" w:date="2018-11-07T17:20:00Z">
+            <w:tcPrChange w:id="298" w:author="zhaowenbo" w:date="2018-11-07T17:20:00Z">
               <w:tcPr>
                 <w:tcW w:w="5584" w:type="dxa"/>
               </w:tcPr>
@@ -6771,10 +6769,10 @@
             <w:pPr>
               <w:ind w:left="0"/>
               <w:rPr>
-                <w:del w:id="300" w:author="zhaowenbo" w:date="2018-11-07T17:21:00Z"/>
-              </w:rPr>
-            </w:pPr>
-            <w:del w:id="301" w:author="zhaowenbo" w:date="2018-11-07T17:21:00Z">
+                <w:del w:id="299" w:author="zhaowenbo" w:date="2018-11-07T17:21:00Z"/>
+              </w:rPr>
+            </w:pPr>
+            <w:del w:id="300" w:author="zhaowenbo" w:date="2018-11-07T17:21:00Z">
               <w:r>
                 <w:delText>INT32 S</w:delText>
               </w:r>
@@ -6796,7 +6794,7 @@
         <w:tc>
           <w:tcPr>
             <w:tcW w:w="4025" w:type="dxa"/>
-            <w:tcPrChange w:id="302" w:author="zhaowenbo" w:date="2018-11-07T17:20:00Z">
+            <w:tcPrChange w:id="301" w:author="zhaowenbo" w:date="2018-11-07T17:20:00Z">
               <w:tcPr>
                 <w:tcW w:w="5812" w:type="dxa"/>
               </w:tcPr>
@@ -6806,10 +6804,10 @@
             <w:pPr>
               <w:ind w:left="0"/>
               <w:rPr>
-                <w:del w:id="303" w:author="zhaowenbo" w:date="2018-11-07T17:21:00Z"/>
-              </w:rPr>
-            </w:pPr>
-            <w:del w:id="304" w:author="zhaowenbo" w:date="2018-11-07T17:21:00Z">
+                <w:del w:id="302" w:author="zhaowenbo" w:date="2018-11-07T17:21:00Z"/>
+              </w:rPr>
+            </w:pPr>
+            <w:del w:id="303" w:author="zhaowenbo" w:date="2018-11-07T17:21:00Z">
               <w:r>
                 <w:rPr>
                   <w:rFonts w:hint="eastAsia"/>
@@ -6843,7 +6841,7 @@
         <w:tc>
           <w:tcPr>
             <w:tcW w:w="1613" w:type="dxa"/>
-            <w:tcPrChange w:id="305" w:author="zhaowenbo" w:date="2018-11-07T17:20:00Z">
+            <w:tcPrChange w:id="304" w:author="zhaowenbo" w:date="2018-11-07T17:20:00Z">
               <w:tcPr>
                 <w:tcW w:w="1417" w:type="dxa"/>
               </w:tcPr>
@@ -6853,10 +6851,10 @@
             <w:pPr>
               <w:ind w:left="0"/>
               <w:rPr>
-                <w:del w:id="306" w:author="zhaowenbo" w:date="2018-11-07T17:21:00Z"/>
-              </w:rPr>
-            </w:pPr>
-            <w:del w:id="307" w:author="zhaowenbo" w:date="2018-11-07T17:21:00Z">
+                <w:del w:id="305" w:author="zhaowenbo" w:date="2018-11-07T17:21:00Z"/>
+              </w:rPr>
+            </w:pPr>
+            <w:del w:id="306" w:author="zhaowenbo" w:date="2018-11-07T17:21:00Z">
               <w:r>
                 <w:rPr>
                   <w:rFonts w:hint="eastAsia"/>
@@ -6869,12 +6867,12 @@
       </w:tr>
       <w:tr>
         <w:trPr>
-          <w:del w:id="308" w:author="zhaowenbo" w:date="2018-11-07T17:21:00Z"/>
+          <w:del w:id="307" w:author="zhaowenbo" w:date="2018-11-07T17:21:00Z"/>
         </w:trPr>
         <w:tc>
           <w:tcPr>
             <w:tcW w:w="1996" w:type="dxa"/>
-            <w:tcPrChange w:id="309" w:author="zhaowenbo" w:date="2018-11-07T17:20:00Z">
+            <w:tcPrChange w:id="308" w:author="zhaowenbo" w:date="2018-11-07T17:20:00Z">
               <w:tcPr>
                 <w:tcW w:w="2840" w:type="dxa"/>
               </w:tcPr>
@@ -6884,10 +6882,10 @@
             <w:pPr>
               <w:ind w:left="0"/>
               <w:rPr>
-                <w:del w:id="310" w:author="zhaowenbo" w:date="2018-11-07T17:21:00Z"/>
-              </w:rPr>
-            </w:pPr>
-            <w:del w:id="311" w:author="zhaowenbo" w:date="2018-11-07T17:21:00Z">
+                <w:del w:id="309" w:author="zhaowenbo" w:date="2018-11-07T17:21:00Z"/>
+              </w:rPr>
+            </w:pPr>
+            <w:del w:id="310" w:author="zhaowenbo" w:date="2018-11-07T17:21:00Z">
               <w:r>
                 <w:rPr>
                   <w:rFonts w:hint="eastAsia"/>
@@ -6900,7 +6898,7 @@
         <w:tc>
           <w:tcPr>
             <w:tcW w:w="5436" w:type="dxa"/>
-            <w:tcPrChange w:id="312" w:author="zhaowenbo" w:date="2018-11-07T17:20:00Z">
+            <w:tcPrChange w:id="311" w:author="zhaowenbo" w:date="2018-11-07T17:20:00Z">
               <w:tcPr>
                 <w:tcW w:w="5584" w:type="dxa"/>
               </w:tcPr>
@@ -6910,10 +6908,10 @@
             <w:pPr>
               <w:ind w:left="0"/>
               <w:rPr>
-                <w:del w:id="313" w:author="zhaowenbo" w:date="2018-11-07T17:21:00Z"/>
-              </w:rPr>
-            </w:pPr>
-            <w:del w:id="314" w:author="zhaowenbo" w:date="2018-11-07T17:21:00Z">
+                <w:del w:id="312" w:author="zhaowenbo" w:date="2018-11-07T17:21:00Z"/>
+              </w:rPr>
+            </w:pPr>
+            <w:del w:id="313" w:author="zhaowenbo" w:date="2018-11-07T17:21:00Z">
               <w:r>
                 <w:rPr>
                   <w:rFonts w:hint="eastAsia"/>
@@ -6944,7 +6942,7 @@
         <w:tc>
           <w:tcPr>
             <w:tcW w:w="4025" w:type="dxa"/>
-            <w:tcPrChange w:id="315" w:author="zhaowenbo" w:date="2018-11-07T17:20:00Z">
+            <w:tcPrChange w:id="314" w:author="zhaowenbo" w:date="2018-11-07T17:20:00Z">
               <w:tcPr>
                 <w:tcW w:w="5812" w:type="dxa"/>
               </w:tcPr>
@@ -6954,10 +6952,10 @@
             <w:pPr>
               <w:ind w:left="0"/>
               <w:rPr>
-                <w:del w:id="316" w:author="zhaowenbo" w:date="2018-11-07T17:21:00Z"/>
-              </w:rPr>
-            </w:pPr>
-            <w:del w:id="317" w:author="zhaowenbo" w:date="2018-11-07T17:21:00Z">
+                <w:del w:id="315" w:author="zhaowenbo" w:date="2018-11-07T17:21:00Z"/>
+              </w:rPr>
+            </w:pPr>
+            <w:del w:id="316" w:author="zhaowenbo" w:date="2018-11-07T17:21:00Z">
               <w:r>
                 <w:rPr>
                   <w:rFonts w:hint="eastAsia"/>
@@ -6970,7 +6968,7 @@
         <w:tc>
           <w:tcPr>
             <w:tcW w:w="1613" w:type="dxa"/>
-            <w:tcPrChange w:id="318" w:author="zhaowenbo" w:date="2018-11-07T17:20:00Z">
+            <w:tcPrChange w:id="317" w:author="zhaowenbo" w:date="2018-11-07T17:20:00Z">
               <w:tcPr>
                 <w:tcW w:w="1417" w:type="dxa"/>
               </w:tcPr>
@@ -6980,10 +6978,10 @@
             <w:pPr>
               <w:ind w:left="0"/>
               <w:rPr>
-                <w:del w:id="319" w:author="zhaowenbo" w:date="2018-11-07T17:21:00Z"/>
-              </w:rPr>
-            </w:pPr>
-            <w:del w:id="320" w:author="zhaowenbo" w:date="2018-11-07T17:21:00Z">
+                <w:del w:id="318" w:author="zhaowenbo" w:date="2018-11-07T17:21:00Z"/>
+              </w:rPr>
+            </w:pPr>
+            <w:del w:id="319" w:author="zhaowenbo" w:date="2018-11-07T17:21:00Z">
               <w:r>
                 <w:rPr>
                   <w:rFonts w:hint="eastAsia"/>
@@ -6996,12 +6994,12 @@
       </w:tr>
       <w:tr>
         <w:trPr>
-          <w:del w:id="321" w:author="zhaowenbo" w:date="2018-11-07T17:21:00Z"/>
+          <w:del w:id="320" w:author="zhaowenbo" w:date="2018-11-07T17:21:00Z"/>
         </w:trPr>
         <w:tc>
           <w:tcPr>
             <w:tcW w:w="1996" w:type="dxa"/>
-            <w:tcPrChange w:id="322" w:author="zhaowenbo" w:date="2018-11-07T17:20:00Z">
+            <w:tcPrChange w:id="321" w:author="zhaowenbo" w:date="2018-11-07T17:20:00Z">
               <w:tcPr>
                 <w:tcW w:w="2840" w:type="dxa"/>
               </w:tcPr>
@@ -7011,10 +7009,10 @@
             <w:pPr>
               <w:ind w:left="0"/>
               <w:rPr>
-                <w:del w:id="323" w:author="zhaowenbo" w:date="2018-11-07T17:21:00Z"/>
-              </w:rPr>
-            </w:pPr>
-            <w:del w:id="324" w:author="zhaowenbo" w:date="2018-11-07T17:21:00Z">
+                <w:del w:id="322" w:author="zhaowenbo" w:date="2018-11-07T17:21:00Z"/>
+              </w:rPr>
+            </w:pPr>
+            <w:del w:id="323" w:author="zhaowenbo" w:date="2018-11-07T17:21:00Z">
               <w:r>
                 <w:rPr>
                   <w:rFonts w:hint="eastAsia"/>
@@ -7027,7 +7025,7 @@
         <w:tc>
           <w:tcPr>
             <w:tcW w:w="5436" w:type="dxa"/>
-            <w:tcPrChange w:id="325" w:author="zhaowenbo" w:date="2018-11-07T17:20:00Z">
+            <w:tcPrChange w:id="324" w:author="zhaowenbo" w:date="2018-11-07T17:20:00Z">
               <w:tcPr>
                 <w:tcW w:w="5584" w:type="dxa"/>
               </w:tcPr>
@@ -7037,10 +7035,10 @@
             <w:pPr>
               <w:ind w:left="0"/>
               <w:rPr>
-                <w:del w:id="326" w:author="zhaowenbo" w:date="2018-11-07T17:21:00Z"/>
-              </w:rPr>
-            </w:pPr>
-            <w:del w:id="327" w:author="zhaowenbo" w:date="2018-11-07T17:21:00Z">
+                <w:del w:id="325" w:author="zhaowenbo" w:date="2018-11-07T17:21:00Z"/>
+              </w:rPr>
+            </w:pPr>
+            <w:del w:id="326" w:author="zhaowenbo" w:date="2018-11-07T17:21:00Z">
               <w:r>
                 <w:rPr>
                   <w:rFonts w:hint="eastAsia"/>
@@ -7059,7 +7057,7 @@
         <w:tc>
           <w:tcPr>
             <w:tcW w:w="4025" w:type="dxa"/>
-            <w:tcPrChange w:id="328" w:author="zhaowenbo" w:date="2018-11-07T17:20:00Z">
+            <w:tcPrChange w:id="327" w:author="zhaowenbo" w:date="2018-11-07T17:20:00Z">
               <w:tcPr>
                 <w:tcW w:w="5812" w:type="dxa"/>
               </w:tcPr>
@@ -7069,10 +7067,10 @@
             <w:pPr>
               <w:ind w:left="0"/>
               <w:rPr>
-                <w:del w:id="329" w:author="zhaowenbo" w:date="2018-11-07T17:21:00Z"/>
-              </w:rPr>
-            </w:pPr>
-            <w:del w:id="330" w:author="zhaowenbo" w:date="2018-11-07T17:21:00Z">
+                <w:del w:id="328" w:author="zhaowenbo" w:date="2018-11-07T17:21:00Z"/>
+              </w:rPr>
+            </w:pPr>
+            <w:del w:id="329" w:author="zhaowenbo" w:date="2018-11-07T17:21:00Z">
               <w:r>
                 <w:rPr>
                   <w:rFonts w:hint="eastAsia"/>
@@ -7085,7 +7083,7 @@
         <w:tc>
           <w:tcPr>
             <w:tcW w:w="1613" w:type="dxa"/>
-            <w:tcPrChange w:id="331" w:author="zhaowenbo" w:date="2018-11-07T17:20:00Z">
+            <w:tcPrChange w:id="330" w:author="zhaowenbo" w:date="2018-11-07T17:20:00Z">
               <w:tcPr>
                 <w:tcW w:w="1417" w:type="dxa"/>
               </w:tcPr>
@@ -7095,10 +7093,10 @@
             <w:pPr>
               <w:ind w:left="0"/>
               <w:rPr>
-                <w:del w:id="332" w:author="zhaowenbo" w:date="2018-11-07T17:21:00Z"/>
-              </w:rPr>
-            </w:pPr>
-            <w:del w:id="333" w:author="zhaowenbo" w:date="2018-11-07T17:21:00Z">
+                <w:del w:id="331" w:author="zhaowenbo" w:date="2018-11-07T17:21:00Z"/>
+              </w:rPr>
+            </w:pPr>
+            <w:del w:id="332" w:author="zhaowenbo" w:date="2018-11-07T17:21:00Z">
               <w:r>
                 <w:rPr>
                   <w:rFonts w:hint="eastAsia"/>
@@ -7113,7 +7111,7 @@
         <w:tc>
           <w:tcPr>
             <w:tcW w:w="1996" w:type="dxa"/>
-            <w:tcPrChange w:id="334" w:author="zhaowenbo" w:date="2018-11-07T17:20:00Z">
+            <w:tcPrChange w:id="333" w:author="zhaowenbo" w:date="2018-11-07T17:20:00Z">
               <w:tcPr>
                 <w:tcW w:w="2840" w:type="dxa"/>
               </w:tcPr>
@@ -7140,7 +7138,7 @@
         <w:tc>
           <w:tcPr>
             <w:tcW w:w="5436" w:type="dxa"/>
-            <w:tcPrChange w:id="335" w:author="zhaowenbo" w:date="2018-11-07T17:20:00Z">
+            <w:tcPrChange w:id="334" w:author="zhaowenbo" w:date="2018-11-07T17:20:00Z">
               <w:tcPr>
                 <w:tcW w:w="5584" w:type="dxa"/>
               </w:tcPr>
@@ -7149,73 +7147,73 @@
           <w:p>
             <w:pPr>
               <w:ind w:left="0"/>
-              <w:pPrChange w:id="336" w:author="zhaowenbo" w:date="2018-11-07T17:21:00Z">
+              <w:pPrChange w:id="335" w:author="zhaowenbo" w:date="2018-11-07T17:21:00Z">
                 <w:pPr>
                   <w:ind w:left="0"/>
                 </w:pPr>
               </w:pPrChange>
             </w:pPr>
-            <w:ins w:id="337" w:author="zhaowenbo" w:date="2018-11-07T17:19:00Z">
+            <w:ins w:id="336" w:author="zhaowenbo" w:date="2018-11-07T17:19:00Z">
               <w:r>
                 <w:t>SDB_EXPORT INT32 sdbGetPasswdByCipherFile( const CHAR</w:t>
               </w:r>
             </w:ins>
-            <w:ins w:id="338" w:author="zhaowenbo" w:date="2018-11-07T17:21:00Z">
+            <w:ins w:id="337" w:author="zhaowenbo" w:date="2018-11-07T17:21:00Z">
               <w:r>
                 <w:t xml:space="preserve"> </w:t>
               </w:r>
             </w:ins>
-            <w:ins w:id="339" w:author="zhaowenbo" w:date="2018-11-07T17:19:00Z">
+            <w:ins w:id="338" w:author="zhaowenbo" w:date="2018-11-07T17:19:00Z">
               <w:r>
                 <w:t>*pUsrName,</w:t>
               </w:r>
             </w:ins>
-            <w:ins w:id="340" w:author="zhaowenbo" w:date="2018-11-07T17:20:00Z">
+            <w:ins w:id="339" w:author="zhaowenbo" w:date="2018-11-07T17:20:00Z">
               <w:r>
                 <w:t xml:space="preserve"> </w:t>
               </w:r>
             </w:ins>
-            <w:ins w:id="341" w:author="zhaowenbo" w:date="2018-11-07T17:19:00Z">
+            <w:ins w:id="340" w:author="zhaowenbo" w:date="2018-11-07T17:19:00Z">
               <w:r>
                 <w:t>const</w:t>
               </w:r>
             </w:ins>
-            <w:ins w:id="342" w:author="zhaowenbo" w:date="2018-11-07T17:20:00Z">
+            <w:ins w:id="341" w:author="zhaowenbo" w:date="2018-11-07T17:20:00Z">
               <w:r>
                 <w:t xml:space="preserve"> </w:t>
               </w:r>
             </w:ins>
-            <w:ins w:id="343" w:author="zhaowenbo" w:date="2018-11-07T17:19:00Z">
+            <w:ins w:id="342" w:author="zhaowenbo" w:date="2018-11-07T17:19:00Z">
               <w:r>
                 <w:t>CHAR</w:t>
               </w:r>
             </w:ins>
-            <w:ins w:id="344" w:author="zhaowenbo" w:date="2018-11-07T17:20:00Z">
+            <w:ins w:id="343" w:author="zhaowenbo" w:date="2018-11-07T17:20:00Z">
               <w:r>
                 <w:t xml:space="preserve"> </w:t>
               </w:r>
             </w:ins>
-            <w:ins w:id="345" w:author="zhaowenbo" w:date="2018-11-07T17:19:00Z">
+            <w:ins w:id="344" w:author="zhaowenbo" w:date="2018-11-07T17:19:00Z">
               <w:r>
                 <w:t>*pToken,                                       const</w:t>
               </w:r>
             </w:ins>
-            <w:ins w:id="346" w:author="zhaowenbo" w:date="2018-11-07T17:20:00Z">
+            <w:ins w:id="345" w:author="zhaowenbo" w:date="2018-11-07T17:20:00Z">
               <w:r>
                 <w:t xml:space="preserve"> </w:t>
               </w:r>
             </w:ins>
-            <w:ins w:id="347" w:author="zhaowenbo" w:date="2018-11-07T17:19:00Z">
+            <w:ins w:id="346" w:author="zhaowenbo" w:date="2018-11-07T17:19:00Z">
               <w:r>
                 <w:t>CHAR</w:t>
               </w:r>
             </w:ins>
-            <w:ins w:id="348" w:author="zhaowenbo" w:date="2018-11-07T17:20:00Z">
+            <w:ins w:id="347" w:author="zhaowenbo" w:date="2018-11-07T17:20:00Z">
               <w:r>
                 <w:t xml:space="preserve"> </w:t>
               </w:r>
             </w:ins>
-            <w:ins w:id="349" w:author="zhaowenbo" w:date="2018-11-07T17:19:00Z">
+            <w:ins w:id="348" w:author="zhaowenbo" w:date="2018-11-07T17:19:00Z">
               <w:r>
                 <w:t>*pCipherFile,</w:t>
               </w:r>
@@ -7226,7 +7224,7 @@
                 <w:t>CHAR **pUser, CHAR **pPasswd ) ;</w:t>
               </w:r>
             </w:ins>
-            <w:del w:id="350" w:author="zhaowenbo" w:date="2018-11-07T17:19:00Z">
+            <w:del w:id="349" w:author="zhaowenbo" w:date="2018-11-07T17:19:00Z">
               <w:r>
                 <w:delText>SDB_EXPORT INT32 sdbConnectByCipherFile ( const CHAR **pConnAddrs, INT32 arrSize, const CHAR *pUsrName, const CHAR *pToken, const CHAR *p</w:delText>
               </w:r>
@@ -7242,7 +7240,7 @@
         <w:tc>
           <w:tcPr>
             <w:tcW w:w="4025" w:type="dxa"/>
-            <w:tcPrChange w:id="351" w:author="zhaowenbo" w:date="2018-11-07T17:20:00Z">
+            <w:tcPrChange w:id="350" w:author="zhaowenbo" w:date="2018-11-07T17:20:00Z">
               <w:tcPr>
                 <w:tcW w:w="5812" w:type="dxa"/>
               </w:tcPr>
@@ -7255,7 +7253,7 @@
                 <w:rFonts w:hint="eastAsia"/>
               </w:rPr>
             </w:pPr>
-            <w:del w:id="352" w:author="zhaowenbo" w:date="2018-11-07T17:21:00Z">
+            <w:del w:id="351" w:author="zhaowenbo" w:date="2018-11-07T17:21:00Z">
               <w:r>
                 <w:rPr>
                   <w:rFonts w:hint="eastAsia"/>
@@ -7317,7 +7315,7 @@
                 <w:delText>解密库解密用户密码。</w:delText>
               </w:r>
             </w:del>
-            <w:ins w:id="353" w:author="zhaowenbo" w:date="2018-11-07T17:21:00Z">
+            <w:ins w:id="352" w:author="zhaowenbo" w:date="2018-11-07T17:21:00Z">
               <w:r>
                 <w:rPr>
                   <w:rFonts w:hint="eastAsia"/>
@@ -7325,7 +7323,7 @@
                 <w:t>在该函数中通过输入的</w:t>
               </w:r>
             </w:ins>
-            <w:ins w:id="354" w:author="zhaowenbo" w:date="2018-11-07T17:22:00Z">
+            <w:ins w:id="353" w:author="zhaowenbo" w:date="2018-11-07T17:22:00Z">
               <w:r>
                 <w:t>pUsrName</w:t>
               </w:r>
@@ -7354,7 +7352,7 @@
                 <w:t>获取解密后的</w:t>
               </w:r>
             </w:ins>
-            <w:ins w:id="355" w:author="zhaowenbo" w:date="2018-11-07T17:23:00Z">
+            <w:ins w:id="354" w:author="zhaowenbo" w:date="2018-11-07T17:23:00Z">
               <w:r>
                 <w:rPr>
                   <w:rFonts w:hint="eastAsia"/>
@@ -7362,7 +7360,7 @@
                 <w:t>用户名和</w:t>
               </w:r>
             </w:ins>
-            <w:ins w:id="356" w:author="zhaowenbo" w:date="2018-11-07T17:22:00Z">
+            <w:ins w:id="355" w:author="zhaowenbo" w:date="2018-11-07T17:22:00Z">
               <w:r>
                 <w:rPr>
                   <w:rFonts w:hint="eastAsia"/>
@@ -7393,7 +7391,7 @@
         <w:tc>
           <w:tcPr>
             <w:tcW w:w="1613" w:type="dxa"/>
-            <w:tcPrChange w:id="357" w:author="zhaowenbo" w:date="2018-11-07T17:20:00Z">
+            <w:tcPrChange w:id="356" w:author="zhaowenbo" w:date="2018-11-07T17:20:00Z">
               <w:tcPr>
                 <w:tcW w:w="1417" w:type="dxa"/>
               </w:tcPr>
@@ -7403,7 +7401,7 @@
             <w:pPr>
               <w:ind w:left="0"/>
               <w:rPr>
-                <w:ins w:id="358" w:author="zhaowenbo" w:date="2018-11-07T17:23:00Z"/>
+                <w:ins w:id="357" w:author="zhaowenbo" w:date="2018-11-07T17:23:00Z"/>
               </w:rPr>
             </w:pPr>
             <w:r>
@@ -7417,7 +7415,7 @@
             <w:pPr>
               <w:ind w:left="0"/>
             </w:pPr>
-            <w:ins w:id="359" w:author="zhaowenbo" w:date="2018-11-07T17:23:00Z">
+            <w:ins w:id="358" w:author="zhaowenbo" w:date="2018-11-07T17:23:00Z">
               <w:r>
                 <w:t>client.c</w:t>
               </w:r>
@@ -7431,7 +7429,7 @@
       <w:r>
         <w:t xml:space="preserve">Postgres fdw </w:t>
       </w:r>
-      <w:del w:id="360" w:author="zhaowenbo" w:date="2018-11-07T17:23:00Z">
+      <w:del w:id="359" w:author="zhaowenbo" w:date="2018-11-07T17:23:00Z">
         <w:r>
           <w:rPr>
             <w:rFonts w:hint="eastAsia"/>
@@ -7445,7 +7443,7 @@
         </w:rPr>
         <w:t>调用</w:t>
       </w:r>
-      <w:ins w:id="361" w:author="zhaowenbo" w:date="2018-11-07T17:23:00Z">
+      <w:ins w:id="360" w:author="zhaowenbo" w:date="2018-11-07T17:23:00Z">
         <w:r>
           <w:t>sdbGetPasswdByCipherFile</w:t>
         </w:r>
@@ -7453,7 +7451,7 @@
           <w:t xml:space="preserve"> </w:t>
         </w:r>
       </w:ins>
-      <w:del w:id="362" w:author="zhaowenbo" w:date="2018-11-07T17:23:00Z">
+      <w:del w:id="361" w:author="zhaowenbo" w:date="2018-11-07T17:23:00Z">
         <w:r>
           <w:delText xml:space="preserve">sdbConnectByCipherFile </w:delText>
         </w:r>
@@ -7464,7 +7462,7 @@
         </w:rPr>
         <w:t>()</w:t>
       </w:r>
-      <w:ins w:id="363" w:author="zhaowenbo" w:date="2018-11-07T17:23:00Z">
+      <w:ins w:id="362" w:author="zhaowenbo" w:date="2018-11-07T17:23:00Z">
         <w:r>
           <w:rPr>
             <w:rFonts w:hint="eastAsia"/>
@@ -7472,7 +7470,7 @@
           <w:t>获取解密密码</w:t>
         </w:r>
       </w:ins>
-      <w:del w:id="364" w:author="zhaowenbo" w:date="2018-11-07T17:23:00Z">
+      <w:del w:id="363" w:author="zhaowenbo" w:date="2018-11-07T17:23:00Z">
         <w:r>
           <w:rPr>
             <w:rFonts w:hint="eastAsia"/>
@@ -7612,40 +7610,40 @@
         </w:rPr>
         <w:t>调用驱动</w:t>
       </w:r>
-      <w:ins w:id="365" w:author="zhaowenbo" w:date="2018-11-07T17:25:00Z">
+      <w:ins w:id="364" w:author="zhaowenbo" w:date="2018-11-07T17:25:00Z">
         <w:r>
           <w:t>sdbGetPasswdByCipherFile</w:t>
         </w:r>
       </w:ins>
+      <w:del w:id="365" w:author="zhaowenbo" w:date="2018-11-07T17:25:00Z">
+        <w:r>
+          <w:rPr>
+            <w:rFonts w:hint="eastAsia"/>
+          </w:rPr>
+          <w:delText xml:space="preserve"> </w:delText>
+        </w:r>
+        <w:r>
+          <w:rPr>
+            <w:rFonts w:hint="eastAsia"/>
+          </w:rPr>
+          <w:delText>sdbConnect</w:delText>
+        </w:r>
+      </w:del>
+      <w:r>
+        <w:rPr>
+          <w:rFonts w:hint="eastAsia"/>
+        </w:rPr>
+        <w:t>()</w:t>
+      </w:r>
       <w:del w:id="366" w:author="zhaowenbo" w:date="2018-11-07T17:25:00Z">
         <w:r>
           <w:rPr>
             <w:rFonts w:hint="eastAsia"/>
           </w:rPr>
-          <w:delText xml:space="preserve"> </w:delText>
-        </w:r>
-        <w:r>
-          <w:rPr>
-            <w:rFonts w:hint="eastAsia"/>
-          </w:rPr>
-          <w:delText>sdbConnect</w:delText>
+          <w:delText>时</w:delText>
         </w:r>
       </w:del>
-      <w:r>
-        <w:rPr>
-          <w:rFonts w:hint="eastAsia"/>
-        </w:rPr>
-        <w:t>()</w:t>
-      </w:r>
-      <w:del w:id="367" w:author="zhaowenbo" w:date="2018-11-07T17:25:00Z">
-        <w:r>
-          <w:rPr>
-            <w:rFonts w:hint="eastAsia"/>
-          </w:rPr>
-          <w:delText>时</w:delText>
-        </w:r>
-      </w:del>
-      <w:ins w:id="368" w:author="zhaowenbo" w:date="2018-11-07T17:25:00Z">
+      <w:ins w:id="367" w:author="zhaowenbo" w:date="2018-11-07T17:25:00Z">
         <w:r>
           <w:rPr>
             <w:rFonts w:hint="eastAsia"/>
@@ -7669,10 +7667,10 @@
         </w:numPr>
         <w:ind w:firstLineChars="0"/>
         <w:rPr>
-          <w:del w:id="369" w:author="zhaowenbo" w:date="2018-11-07T17:25:00Z"/>
-        </w:rPr>
-      </w:pPr>
-      <w:del w:id="370" w:author="zhaowenbo" w:date="2018-11-07T17:25:00Z">
+          <w:del w:id="368" w:author="zhaowenbo" w:date="2018-11-07T17:25:00Z"/>
+        </w:rPr>
+      </w:pPr>
+      <w:del w:id="369" w:author="zhaowenbo" w:date="2018-11-07T17:25:00Z">
         <w:r>
           <w:rPr>
             <w:rFonts w:hint="eastAsia"/>
@@ -7714,10 +7712,10 @@
         </w:numPr>
         <w:ind w:firstLineChars="0"/>
         <w:rPr>
-          <w:del w:id="371" w:author="zhaowenbo" w:date="2018-11-07T17:25:00Z"/>
-        </w:rPr>
-      </w:pPr>
-      <w:del w:id="372" w:author="zhaowenbo" w:date="2018-11-07T17:25:00Z">
+          <w:del w:id="370" w:author="zhaowenbo" w:date="2018-11-07T17:25:00Z"/>
+        </w:rPr>
+      </w:pPr>
+      <w:del w:id="371" w:author="zhaowenbo" w:date="2018-11-07T17:25:00Z">
         <w:r>
           <w:rPr>
             <w:rFonts w:hint="eastAsia"/>
@@ -7810,10 +7808,10 @@
         </w:numPr>
         <w:ind w:firstLineChars="0"/>
         <w:rPr>
-          <w:del w:id="373" w:author="zhaowenbo" w:date="2018-11-07T17:25:00Z"/>
-        </w:rPr>
-      </w:pPr>
-      <w:del w:id="374" w:author="zhaowenbo" w:date="2018-11-07T17:25:00Z">
+          <w:del w:id="372" w:author="zhaowenbo" w:date="2018-11-07T17:25:00Z"/>
+        </w:rPr>
+      </w:pPr>
+      <w:del w:id="373" w:author="zhaowenbo" w:date="2018-11-07T17:25:00Z">
         <w:r>
           <w:rPr>
             <w:rFonts w:hint="eastAsia"/>
@@ -7952,10 +7950,10 @@
               <w:pStyle w:val="aa"/>
               <w:ind w:left="0"/>
               <w:rPr>
-                <w:ins w:id="375" w:author="zhaowenbo" w:date="2018-11-07T17:26:00Z"/>
-              </w:rPr>
-            </w:pPr>
-            <w:ins w:id="376" w:author="zhaowenbo" w:date="2018-11-07T17:26:00Z">
+                <w:ins w:id="374" w:author="zhaowenbo" w:date="2018-11-07T17:26:00Z"/>
+              </w:rPr>
+            </w:pPr>
+            <w:ins w:id="375" w:author="zhaowenbo" w:date="2018-11-07T17:26:00Z">
               <w:r>
                 <w:t>INT32 decryptUserCipher( const CHAR* pUsername, const CHAR *pToken,</w:t>
               </w:r>
@@ -7966,7 +7964,7 @@
               <w:pStyle w:val="aa"/>
               <w:ind w:left="0" w:firstLineChars="0" w:firstLine="0"/>
             </w:pPr>
-            <w:ins w:id="377" w:author="zhaowenbo" w:date="2018-11-07T17:26:00Z">
+            <w:ins w:id="376" w:author="zhaowenbo" w:date="2018-11-07T17:26:00Z">
               <w:r>
                 <w:t xml:space="preserve">                         </w:t>
               </w:r>
@@ -7977,7 +7975,7 @@
                 <w:t>const CHAR *pPath, CHAR **pPasswd ) ;</w:t>
               </w:r>
             </w:ins>
-            <w:del w:id="378" w:author="zhaowenbo" w:date="2018-11-07T17:26:00Z">
+            <w:del w:id="377" w:author="zhaowenbo" w:date="2018-11-07T17:26:00Z">
               <w:r>
                 <w:rPr>
                   <w:rFonts w:hint="eastAsia"/>
@@ -8055,7 +8053,7 @@
               <w:rPr>
                 <w:rFonts w:hint="eastAsia"/>
               </w:rPr>
-              <w:pPrChange w:id="379" w:author="zhaowenbo" w:date="2018-11-07T17:26:00Z">
+              <w:pPrChange w:id="378" w:author="zhaowenbo" w:date="2018-11-07T17:26:00Z">
                 <w:pPr>
                   <w:pStyle w:val="aa"/>
                   <w:ind w:left="0" w:firstLineChars="0" w:firstLine="0"/>
@@ -8068,7 +8066,7 @@
               </w:rPr>
               <w:t>在加密文件中寻找对应用户密文并解密</w:t>
             </w:r>
-            <w:del w:id="380" w:author="zhaowenbo" w:date="2018-11-07T17:26:00Z">
+            <w:del w:id="379" w:author="zhaowenbo" w:date="2018-11-07T17:26:00Z">
               <w:r>
                 <w:rPr>
                   <w:rFonts w:hint="eastAsia"/>
@@ -8103,10 +8101,10 @@
         <w:pStyle w:val="aa"/>
         <w:ind w:left="777" w:firstLineChars="0" w:firstLine="0"/>
         <w:rPr>
-          <w:del w:id="381" w:author="zhaowenbo" w:date="2018-11-07T17:24:00Z"/>
-        </w:rPr>
-      </w:pPr>
-      <w:del w:id="382" w:author="zhaowenbo" w:date="2018-11-07T17:24:00Z">
+          <w:del w:id="380" w:author="zhaowenbo" w:date="2018-11-07T17:24:00Z"/>
+        </w:rPr>
+      </w:pPr>
+      <w:del w:id="381" w:author="zhaowenbo" w:date="2018-11-07T17:24:00Z">
         <w:r>
           <w:rPr>
             <w:rFonts w:hint="eastAsia"/>
@@ -8156,7 +8154,7 @@
         </w:rPr>
         <w:t>PostgreSQL</w:t>
       </w:r>
-      <w:ins w:id="383" w:author="zhaowenbo" w:date="2018-11-07T17:24:00Z">
+      <w:ins w:id="382" w:author="zhaowenbo" w:date="2018-11-07T17:24:00Z">
         <w:r>
           <w:rPr>
             <w:rFonts w:hint="eastAsia"/>
@@ -8164,7 +8162,7 @@
           <w:t>连接器</w:t>
         </w:r>
       </w:ins>
-      <w:del w:id="384" w:author="zhaowenbo" w:date="2018-11-07T17:24:00Z">
+      <w:del w:id="383" w:author="zhaowenbo" w:date="2018-11-07T17:24:00Z">
         <w:r>
           <w:rPr>
             <w:rFonts w:hint="eastAsia"/>
@@ -8193,7 +8191,7 @@
         </w:rPr>
         <w:t>编译时调用</w:t>
       </w:r>
-      <w:ins w:id="385" w:author="zhaowenbo" w:date="2018-11-07T17:24:00Z">
+      <w:ins w:id="384" w:author="zhaowenbo" w:date="2018-11-07T17:24:00Z">
         <w:r>
           <w:rPr>
             <w:rFonts w:hint="eastAsia"/>
@@ -8267,7 +8265,7 @@
         </w:rPr>
         <w:t>库增加回显开关的控制，当关闭时</w:t>
       </w:r>
-      <w:ins w:id="386" w:author="zhaowenbo" w:date="2018-11-07T17:36:00Z">
+      <w:ins w:id="385" w:author="zhaowenbo" w:date="2018-11-07T17:36:00Z">
         <w:r>
           <w:rPr>
             <w:rFonts w:hint="eastAsia"/>
@@ -8275,7 +8273,7 @@
           <w:t>不在屏幕上显示用户输入的内容</w:t>
         </w:r>
       </w:ins>
-      <w:del w:id="387" w:author="zhaowenbo" w:date="2018-11-07T17:36:00Z">
+      <w:del w:id="386" w:author="zhaowenbo" w:date="2018-11-07T17:36:00Z">
         <w:r>
           <w:rPr>
             <w:rFonts w:hint="eastAsia"/>
@@ -8295,7 +8293,7 @@
         <w:pStyle w:val="aa"/>
         <w:ind w:left="777" w:firstLineChars="0" w:firstLine="0"/>
         <w:rPr>
-          <w:ins w:id="388" w:author="zhaowenbo" w:date="2018-11-07T17:29:00Z"/>
+          <w:ins w:id="387" w:author="zhaowenbo" w:date="2018-11-07T17:29:00Z"/>
         </w:rPr>
       </w:pPr>
       <w:r>
@@ -8331,7 +8329,7 @@
       <w:r>
         <w:t xml:space="preserve">choChar = </w:t>
       </w:r>
-      <w:del w:id="389" w:author="zhaowenbo" w:date="2018-11-07T17:35:00Z">
+      <w:del w:id="388" w:author="zhaowenbo" w:date="2018-11-07T17:35:00Z">
         <w:r>
           <w:rPr>
             <w:rFonts w:hint="eastAsia"/>
@@ -8339,7 +8337,7 @@
           <w:delText>-1</w:delText>
         </w:r>
       </w:del>
-      <w:ins w:id="390" w:author="zhaowenbo" w:date="2018-11-07T17:35:00Z">
+      <w:ins w:id="389" w:author="zhaowenbo" w:date="2018-11-07T17:35:00Z">
         <w:r>
           <w:rPr>
             <w:rFonts w:hint="eastAsia"/>
@@ -8359,11 +8357,11 @@
         <w:pStyle w:val="aa"/>
         <w:ind w:left="777" w:firstLineChars="0" w:firstLine="0"/>
         <w:rPr>
-          <w:ins w:id="391" w:author="zhaowenbo" w:date="2018-11-07T17:29:00Z"/>
-          <w:rFonts w:hint="eastAsia"/>
-        </w:rPr>
-      </w:pPr>
-      <w:ins w:id="392" w:author="zhaowenbo" w:date="2018-11-07T17:29:00Z">
+          <w:ins w:id="390" w:author="zhaowenbo" w:date="2018-11-07T17:29:00Z"/>
+          <w:rFonts w:hint="eastAsia"/>
+        </w:rPr>
+      </w:pPr>
+      <w:ins w:id="391" w:author="zhaowenbo" w:date="2018-11-07T17:29:00Z">
         <w:r>
           <w:rPr>
             <w:rFonts w:hint="eastAsia"/>
@@ -8377,10 +8375,10 @@
         <w:pStyle w:val="aa"/>
         <w:ind w:left="777"/>
         <w:rPr>
-          <w:ins w:id="393" w:author="zhaowenbo" w:date="2018-11-07T17:29:00Z"/>
-        </w:rPr>
-      </w:pPr>
-      <w:ins w:id="394" w:author="zhaowenbo" w:date="2018-11-07T17:29:00Z">
+          <w:ins w:id="392" w:author="zhaowenbo" w:date="2018-11-07T17:29:00Z"/>
+        </w:rPr>
+      </w:pPr>
+      <w:ins w:id="393" w:author="zhaowenbo" w:date="2018-11-07T17:29:00Z">
         <w:r>
           <w:t xml:space="preserve">void setEchoOn() </w:t>
         </w:r>
@@ -8397,10 +8395,10 @@
         <w:pStyle w:val="aa"/>
         <w:ind w:left="777"/>
         <w:rPr>
-          <w:ins w:id="395" w:author="zhaowenbo" w:date="2018-11-07T17:29:00Z"/>
-        </w:rPr>
-      </w:pPr>
-      <w:ins w:id="396" w:author="zhaowenbo" w:date="2018-11-07T17:29:00Z">
+          <w:ins w:id="394" w:author="zhaowenbo" w:date="2018-11-07T17:29:00Z"/>
+        </w:rPr>
+      </w:pPr>
+      <w:ins w:id="395" w:author="zhaowenbo" w:date="2018-11-07T17:29:00Z">
         <w:r>
           <w:t xml:space="preserve">void setEchoOff() </w:t>
         </w:r>
@@ -8411,7 +8409,7 @@
           <w:t>设置关闭</w:t>
         </w:r>
       </w:ins>
-      <w:ins w:id="397" w:author="zhaowenbo" w:date="2018-11-07T17:30:00Z">
+      <w:ins w:id="396" w:author="zhaowenbo" w:date="2018-11-07T17:30:00Z">
         <w:r>
           <w:rPr>
             <w:rFonts w:hint="eastAsia"/>
@@ -8427,14 +8425,14 @@
         <w:rPr>
           <w:rFonts w:hint="eastAsia"/>
         </w:rPr>
-        <w:pPrChange w:id="398" w:author="zhaowenbo" w:date="2018-11-07T17:29:00Z">
+        <w:pPrChange w:id="397" w:author="zhaowenbo" w:date="2018-11-07T17:29:00Z">
           <w:pPr>
             <w:pStyle w:val="aa"/>
             <w:ind w:left="777" w:firstLineChars="0" w:firstLine="0"/>
           </w:pPr>
         </w:pPrChange>
       </w:pPr>
-      <w:ins w:id="399" w:author="zhaowenbo" w:date="2018-11-07T17:29:00Z">
+      <w:ins w:id="398" w:author="zhaowenbo" w:date="2018-11-07T17:29:00Z">
         <w:r>
           <w:t>void setEchoChar(char c)</w:t>
         </w:r>
@@ -8442,7 +8440,7 @@
           <w:t xml:space="preserve"> </w:t>
         </w:r>
       </w:ins>
-      <w:ins w:id="400" w:author="zhaowenbo" w:date="2018-11-07T17:30:00Z">
+      <w:ins w:id="399" w:author="zhaowenbo" w:date="2018-11-07T17:30:00Z">
         <w:r>
           <w:rPr>
             <w:rFonts w:hint="eastAsia"/>
@@ -8456,10 +8454,10 @@
         <w:pStyle w:val="aa"/>
         <w:ind w:left="777" w:firstLineChars="0" w:firstLine="0"/>
         <w:rPr>
-          <w:del w:id="401" w:author="zhaowenbo" w:date="2018-11-07T17:29:00Z"/>
-        </w:rPr>
-      </w:pPr>
-      <w:del w:id="402" w:author="zhaowenbo" w:date="2018-11-07T17:29:00Z">
+          <w:del w:id="400" w:author="zhaowenbo" w:date="2018-11-07T17:29:00Z"/>
+        </w:rPr>
+      </w:pPr>
+      <w:del w:id="401" w:author="zhaowenbo" w:date="2018-11-07T17:29:00Z">
         <w:r>
           <w:rPr>
             <w:rFonts w:hint="eastAsia"/>
@@ -8485,10 +8483,10 @@
         <w:pStyle w:val="aa"/>
         <w:ind w:left="777" w:firstLineChars="0" w:firstLine="0"/>
         <w:rPr>
-          <w:del w:id="403" w:author="zhaowenbo" w:date="2018-11-07T17:29:00Z"/>
-        </w:rPr>
-      </w:pPr>
-      <w:del w:id="404" w:author="zhaowenbo" w:date="2018-11-07T17:29:00Z">
+          <w:del w:id="402" w:author="zhaowenbo" w:date="2018-11-07T17:29:00Z"/>
+        </w:rPr>
+      </w:pPr>
+      <w:del w:id="403" w:author="zhaowenbo" w:date="2018-11-07T17:29:00Z">
         <w:r>
           <w:rPr>
             <w:rFonts w:hint="eastAsia"/>
@@ -8517,10 +8515,10 @@
         <w:pStyle w:val="aa"/>
         <w:ind w:left="777" w:firstLineChars="0" w:firstLine="0"/>
         <w:rPr>
-          <w:del w:id="405" w:author="zhaowenbo" w:date="2018-11-07T17:29:00Z"/>
-        </w:rPr>
-      </w:pPr>
-      <w:del w:id="406" w:author="zhaowenbo" w:date="2018-11-07T17:29:00Z">
+          <w:del w:id="404" w:author="zhaowenbo" w:date="2018-11-07T17:29:00Z"/>
+        </w:rPr>
+      </w:pPr>
+      <w:del w:id="405" w:author="zhaowenbo" w:date="2018-11-07T17:29:00Z">
         <w:r>
           <w:rPr>
             <w:rFonts w:hint="eastAsia"/>
@@ -8670,7 +8668,7 @@
       <w:r>
         <w:t>ser</w:t>
       </w:r>
-      <w:del w:id="407" w:author="zhaowenbo" w:date="2018-11-07T17:30:00Z">
+      <w:del w:id="406" w:author="zhaowenbo" w:date="2018-11-07T17:30:00Z">
         <w:r>
           <w:rPr>
             <w:rFonts w:hint="eastAsia"/>
@@ -8712,7 +8710,7 @@
       <w:r>
         <w:t>ser</w:t>
       </w:r>
-      <w:del w:id="408" w:author="zhaowenbo" w:date="2018-11-07T17:30:00Z">
+      <w:del w:id="407" w:author="zhaowenbo" w:date="2018-11-07T17:30:00Z">
         <w:r>
           <w:rPr>
             <w:rFonts w:hint="eastAsia"/>
@@ -9126,7 +9124,7 @@
         </w:rPr>
         <w:t>username</w:t>
       </w:r>
-      <w:del w:id="409" w:author="zhaowenbo" w:date="2018-11-07T17:32:00Z">
+      <w:del w:id="408" w:author="zhaowenbo" w:date="2018-11-07T17:32:00Z">
         <w:r>
           <w:rPr>
             <w:rFonts w:hint="eastAsia"/>
@@ -9437,7 +9435,7 @@
       <w:pPr>
         <w:ind w:left="777"/>
         <w:rPr>
-          <w:ins w:id="410" w:author="zhaowenbo" w:date="2018-11-08T11:31:00Z"/>
+          <w:ins w:id="409" w:author="zhaowenbo" w:date="2018-11-08T11:31:00Z"/>
         </w:rPr>
       </w:pPr>
       <w:r>
@@ -9550,7 +9548,7 @@
           <w:rFonts w:hint="eastAsia"/>
         </w:rPr>
       </w:pPr>
-      <w:ins w:id="411" w:author="zhaowenbo" w:date="2018-11-08T11:31:00Z">
+      <w:ins w:id="410" w:author="zhaowenbo" w:date="2018-11-08T11:31:00Z">
         <w:r>
           <w:rPr>
             <w:rFonts w:hint="eastAsia"/>
@@ -9558,7 +9556,7 @@
           <w:t>由于</w:t>
         </w:r>
       </w:ins>
-      <w:ins w:id="412" w:author="zhaowenbo" w:date="2018-11-08T11:32:00Z">
+      <w:ins w:id="411" w:author="zhaowenbo" w:date="2018-11-08T11:32:00Z">
         <w:r>
           <w:rPr>
             <w:rFonts w:hint="eastAsia"/>
@@ -9578,7 +9576,7 @@
           <w:t>只</w:t>
         </w:r>
       </w:ins>
-      <w:ins w:id="413" w:author="zhaowenbo" w:date="2018-11-08T11:33:00Z">
+      <w:ins w:id="412" w:author="zhaowenbo" w:date="2018-11-08T11:33:00Z">
         <w:r>
           <w:rPr>
             <w:rFonts w:hint="eastAsia"/>
@@ -9586,7 +9584,7 @@
           <w:t>能</w:t>
         </w:r>
       </w:ins>
-      <w:ins w:id="414" w:author="zhaowenbo" w:date="2018-11-08T11:32:00Z">
+      <w:ins w:id="413" w:author="zhaowenbo" w:date="2018-11-08T11:32:00Z">
         <w:r>
           <w:rPr>
             <w:rFonts w:hint="eastAsia"/>
@@ -9600,7 +9598,7 @@
           <w:t xml:space="preserve"> 234</w:t>
         </w:r>
       </w:ins>
-      <w:ins w:id="415" w:author="zhaowenbo" w:date="2018-11-08T11:33:00Z">
+      <w:ins w:id="414" w:author="zhaowenbo" w:date="2018-11-08T11:33:00Z">
         <w:r>
           <w:rPr>
             <w:rFonts w:hint="eastAsia"/>
@@ -11226,10 +11224,10 @@
         <w:tblLook w:val="04A0" w:firstRow="1" w:lastRow="0" w:firstColumn="1" w:lastColumn="0" w:noHBand="0" w:noVBand="1"/>
       </w:tblPr>
       <w:tblGrid>
-        <w:gridCol w:w="1336"/>
-        <w:gridCol w:w="2702"/>
-        <w:gridCol w:w="6654"/>
-        <w:gridCol w:w="2693"/>
+        <w:gridCol w:w="1275"/>
+        <w:gridCol w:w="2585"/>
+        <w:gridCol w:w="6556"/>
+        <w:gridCol w:w="2654"/>
       </w:tblGrid>
       <w:tr>
         <w:tc>
@@ -11369,7 +11367,7 @@
           <w:p>
             <w:pPr>
               <w:ind w:left="0"/>
-              <w:pPrChange w:id="416" w:author="zhaowenbo" w:date="2018-11-07T17:31:00Z">
+              <w:pPrChange w:id="415" w:author="zhaowenbo" w:date="2018-11-07T17:31:00Z">
                 <w:pPr>
                   <w:ind w:left="0"/>
                 </w:pPr>
@@ -11384,7 +11382,7 @@
             <w:r>
               <w:t>bin/sdbpasswd –adduser xxx</w:t>
             </w:r>
-            <w:ins w:id="417" w:author="zhaowenbo" w:date="2018-11-08T11:36:00Z">
+            <w:ins w:id="416" w:author="zhaowenbo" w:date="2018-11-08T11:36:00Z">
               <w:r>
                 <w:rPr>
                   <w:rFonts w:hint="eastAsia"/>
@@ -11395,7 +11393,7 @@
             <w:r>
               <w:t xml:space="preserve"> </w:t>
             </w:r>
-            <w:del w:id="418" w:author="zhaowenbo" w:date="2018-11-07T17:31:00Z">
+            <w:del w:id="417" w:author="zhaowenbo" w:date="2018-11-07T17:31:00Z">
               <w:r>
                 <w:delText xml:space="preserve">–cluster yyy </w:delText>
               </w:r>
@@ -11513,7 +11511,7 @@
               <w:rPr>
                 <w:rFonts w:hint="eastAsia"/>
               </w:rPr>
-              <w:pPrChange w:id="419" w:author="zhaowenbo" w:date="2018-11-07T17:31:00Z">
+              <w:pPrChange w:id="418" w:author="zhaowenbo" w:date="2018-11-07T17:31:00Z">
                 <w:pPr>
                   <w:ind w:left="0"/>
                 </w:pPr>
@@ -11528,7 +11526,7 @@
             <w:r>
               <w:t>bin/sdbpasswd –adduser xxx</w:t>
             </w:r>
-            <w:ins w:id="420" w:author="zhaowenbo" w:date="2018-11-08T11:36:00Z">
+            <w:ins w:id="419" w:author="zhaowenbo" w:date="2018-11-08T11:36:00Z">
               <w:r>
                 <w:t>@yyy</w:t>
               </w:r>
@@ -11536,7 +11534,7 @@
             <w:r>
               <w:t xml:space="preserve"> </w:t>
             </w:r>
-            <w:del w:id="421" w:author="zhaowenbo" w:date="2018-11-07T17:31:00Z">
+            <w:del w:id="420" w:author="zhaowenbo" w:date="2018-11-07T17:31:00Z">
               <w:r>
                 <w:delText xml:space="preserve">–cluster yyy </w:delText>
               </w:r>
@@ -11658,7 +11656,7 @@
             <w:r>
               <w:t>bin/sdbpasswd –adduser xxx</w:t>
             </w:r>
-            <w:ins w:id="422" w:author="zhaowenbo" w:date="2018-11-08T11:36:00Z">
+            <w:ins w:id="421" w:author="zhaowenbo" w:date="2018-11-08T11:36:00Z">
               <w:r>
                 <w:t xml:space="preserve"> --password</w:t>
               </w:r>
@@ -11910,7 +11908,7 @@
             <w:r>
               <w:t>bin/sdbpasswd –adduser xxx</w:t>
             </w:r>
-            <w:del w:id="423" w:author="zhaowenbo" w:date="2018-11-07T17:32:00Z">
+            <w:del w:id="422" w:author="zhaowenbo" w:date="2018-11-07T17:32:00Z">
               <w:r>
                 <w:rPr>
                   <w:rFonts w:hint="eastAsia"/>
@@ -11930,7 +11928,7 @@
                 <w:delText xml:space="preserve">cluster </w:delText>
               </w:r>
             </w:del>
-            <w:ins w:id="424" w:author="zhaowenbo" w:date="2018-11-07T17:32:00Z">
+            <w:ins w:id="423" w:author="zhaowenbo" w:date="2018-11-07T17:32:00Z">
               <w:r>
                 <w:rPr>
                   <w:rFonts w:hint="eastAsia"/>
@@ -11975,7 +11973,7 @@
             <w:r>
               <w:t>xxx</w:t>
             </w:r>
-            <w:del w:id="425" w:author="zhaowenbo" w:date="2018-11-07T17:32:00Z">
+            <w:del w:id="424" w:author="zhaowenbo" w:date="2018-11-07T17:32:00Z">
               <w:r>
                 <w:rPr>
                   <w:rFonts w:hint="eastAsia"/>
@@ -11995,7 +11993,7 @@
                 <w:delText xml:space="preserve">cluster </w:delText>
               </w:r>
             </w:del>
-            <w:ins w:id="426" w:author="zhaowenbo" w:date="2018-11-07T17:32:00Z">
+            <w:ins w:id="425" w:author="zhaowenbo" w:date="2018-11-07T17:32:00Z">
               <w:r>
                 <w:rPr>
                   <w:rFonts w:hint="eastAsia"/>
@@ -12237,7 +12235,7 @@
               </w:rPr>
               <w:t>xxx</w:t>
             </w:r>
-            <w:del w:id="427" w:author="zhaowenbo" w:date="2018-11-07T17:32:00Z">
+            <w:del w:id="426" w:author="zhaowenbo" w:date="2018-11-07T17:32:00Z">
               <w:r>
                 <w:rPr>
                   <w:rFonts w:hint="eastAsia"/>
@@ -12257,7 +12255,7 @@
                 <w:delText xml:space="preserve">cluster </w:delText>
               </w:r>
             </w:del>
-            <w:ins w:id="428" w:author="zhaowenbo" w:date="2018-11-07T17:32:00Z">
+            <w:ins w:id="427" w:author="zhaowenbo" w:date="2018-11-07T17:32:00Z">
               <w:r>
                 <w:rPr>
                   <w:rFonts w:hint="eastAsia"/>
@@ -12347,7 +12345,7 @@
                 <w:numId w:val="24"/>
               </w:numPr>
               <w:ind w:firstLineChars="0"/>
-              <w:pPrChange w:id="429" w:author="zhaowenbo" w:date="2018-11-08T11:37:00Z">
+              <w:pPrChange w:id="428" w:author="zhaowenbo" w:date="2018-11-08T11:37:00Z">
                 <w:pPr>
                   <w:pStyle w:val="aa"/>
                   <w:numPr>
@@ -12390,7 +12388,7 @@
               </w:rPr>
               <w:t>xxx</w:t>
             </w:r>
-            <w:del w:id="430" w:author="zhaowenbo" w:date="2018-11-07T17:32:00Z">
+            <w:del w:id="429" w:author="zhaowenbo" w:date="2018-11-07T17:32:00Z">
               <w:r>
                 <w:rPr>
                   <w:rFonts w:hint="eastAsia"/>
@@ -12410,7 +12408,7 @@
                 <w:delText xml:space="preserve">cluster </w:delText>
               </w:r>
             </w:del>
-            <w:ins w:id="431" w:author="zhaowenbo" w:date="2018-11-07T17:32:00Z">
+            <w:ins w:id="430" w:author="zhaowenbo" w:date="2018-11-07T17:32:00Z">
               <w:r>
                 <w:rPr>
                   <w:rFonts w:hint="eastAsia"/>
@@ -12439,7 +12437,7 @@
                 <w:numId w:val="24"/>
               </w:numPr>
               <w:ind w:firstLineChars="0"/>
-              <w:pPrChange w:id="432" w:author="zhaowenbo" w:date="2018-11-08T11:37:00Z">
+              <w:pPrChange w:id="431" w:author="zhaowenbo" w:date="2018-11-08T11:37:00Z">
                 <w:pPr>
                   <w:pStyle w:val="aa"/>
                   <w:numPr>
@@ -12482,7 +12480,7 @@
               </w:rPr>
               <w:t>xxx</w:t>
             </w:r>
-            <w:del w:id="433" w:author="zhaowenbo" w:date="2018-11-07T17:32:00Z">
+            <w:del w:id="432" w:author="zhaowenbo" w:date="2018-11-07T17:32:00Z">
               <w:r>
                 <w:rPr>
                   <w:rFonts w:hint="eastAsia"/>
@@ -12502,7 +12500,7 @@
                 <w:delText xml:space="preserve">cluster </w:delText>
               </w:r>
             </w:del>
-            <w:ins w:id="434" w:author="zhaowenbo" w:date="2018-11-07T17:32:00Z">
+            <w:ins w:id="433" w:author="zhaowenbo" w:date="2018-11-07T17:32:00Z">
               <w:r>
                 <w:rPr>
                   <w:rFonts w:hint="eastAsia"/>
@@ -12512,6 +12510,58 @@
             </w:ins>
             <w:r>
               <w:t>yyy</w:t>
+            </w:r>
+          </w:p>
+          <w:p>
+            <w:pPr>
+              <w:pStyle w:val="aa"/>
+              <w:numPr>
+                <w:ilvl w:val="0"/>
+                <w:numId w:val="24"/>
+              </w:numPr>
+              <w:ind w:firstLineChars="0"/>
+              <w:pPrChange w:id="434" w:author="zhaowenbo" w:date="2018-11-08T11:37:00Z">
+                <w:pPr>
+                  <w:pStyle w:val="aa"/>
+                  <w:numPr>
+                    <w:numId w:val="22"/>
+                  </w:numPr>
+                  <w:ind w:left="360" w:firstLineChars="0" w:hanging="360"/>
+                </w:pPr>
+              </w:pPrChange>
+            </w:pPr>
+            <w:r>
+              <w:t>T</w:t>
+            </w:r>
+            <w:r>
+              <w:rPr>
+                <w:rFonts w:hint="eastAsia"/>
+              </w:rPr>
+              <w:t>oo</w:t>
+            </w:r>
+            <w:r>
+              <w:t>l --hostname localhost --svcname</w:t>
+            </w:r>
+            <w:r>
+              <w:t xml:space="preserve"> </w:t>
+            </w:r>
+            <w:r>
+              <w:rPr>
+                <w:rFonts w:hint="eastAsia"/>
+              </w:rPr>
+              <w:t>11810</w:t>
+            </w:r>
+            <w:r>
+              <w:t xml:space="preserve"> --user</w:t>
+            </w:r>
+            <w:r>
+              <w:t xml:space="preserve"> </w:t>
+            </w:r>
+            <w:r>
+              <w:rPr>
+                <w:rFonts w:hint="eastAsia"/>
+              </w:rPr>
+              <w:t>xxx</w:t>
             </w:r>
           </w:p>
           <w:p>
@@ -12554,16 +12604,47 @@
               <w:t>11810</w:t>
             </w:r>
             <w:r>
-              <w:t xml:space="preserve"> --user</w:t>
-            </w:r>
-            <w:r>
               <w:t xml:space="preserve"> </w:t>
             </w:r>
             <w:r>
-              <w:rPr>
-                <w:rFonts w:hint="eastAsia"/>
-              </w:rPr>
-              <w:t>xxx</w:t>
+              <w:t>–</w:t>
+            </w:r>
+            <w:r>
+              <w:t>user</w:t>
+            </w:r>
+            <w:r>
+              <w:t xml:space="preserve"> xxx</w:t>
+            </w:r>
+            <w:del w:id="436" w:author="zhaowenbo" w:date="2018-11-07T17:32:00Z">
+              <w:r>
+                <w:rPr>
+                  <w:rFonts w:hint="eastAsia"/>
+                </w:rPr>
+                <w:delText xml:space="preserve"> </w:delText>
+              </w:r>
+              <w:r>
+                <w:rPr>
+                  <w:rFonts w:hint="eastAsia"/>
+                </w:rPr>
+                <w:delText>–</w:delText>
+              </w:r>
+              <w:r>
+                <w:rPr>
+                  <w:rFonts w:hint="eastAsia"/>
+                </w:rPr>
+                <w:delText xml:space="preserve">cluster </w:delText>
+              </w:r>
+            </w:del>
+            <w:ins w:id="437" w:author="zhaowenbo" w:date="2018-11-07T17:32:00Z">
+              <w:r>
+                <w:rPr>
+                  <w:rFonts w:hint="eastAsia"/>
+                </w:rPr>
+                <w:t>@</w:t>
+              </w:r>
+            </w:ins>
+            <w:r>
+              <w:t xml:space="preserve">zzz </w:t>
             </w:r>
           </w:p>
           <w:p>
@@ -12574,7 +12655,7 @@
                 <w:numId w:val="24"/>
               </w:numPr>
               <w:ind w:firstLineChars="0"/>
-              <w:pPrChange w:id="436" w:author="zhaowenbo" w:date="2018-11-08T11:37:00Z">
+              <w:pPrChange w:id="438" w:author="zhaowenbo" w:date="2018-11-08T11:37:00Z">
                 <w:pPr>
                   <w:pStyle w:val="aa"/>
                   <w:numPr>
@@ -12594,7 +12675,13 @@
               <w:t>oo</w:t>
             </w:r>
             <w:r>
-              <w:t>l --hostname localhost --svcname</w:t>
+              <w:t>l</w:t>
+            </w:r>
+            <w:r>
+              <w:t xml:space="preserve"> --hostname</w:t>
+            </w:r>
+            <w:r>
+              <w:t xml:space="preserve"> localhost --svcname</w:t>
             </w:r>
             <w:r>
               <w:t xml:space="preserve"> </w:t>
@@ -12606,47 +12693,16 @@
               <w:t>11810</w:t>
             </w:r>
             <w:r>
-              <w:t xml:space="preserve"> </w:t>
-            </w:r>
-            <w:r>
-              <w:t>–</w:t>
-            </w:r>
-            <w:r>
-              <w:t>user</w:t>
-            </w:r>
-            <w:r>
-              <w:t xml:space="preserve"> xxx</w:t>
-            </w:r>
-            <w:del w:id="437" w:author="zhaowenbo" w:date="2018-11-07T17:32:00Z">
-              <w:r>
-                <w:rPr>
-                  <w:rFonts w:hint="eastAsia"/>
-                </w:rPr>
-                <w:delText xml:space="preserve"> </w:delText>
-              </w:r>
-              <w:r>
-                <w:rPr>
-                  <w:rFonts w:hint="eastAsia"/>
-                </w:rPr>
-                <w:delText>–</w:delText>
-              </w:r>
-              <w:r>
-                <w:rPr>
-                  <w:rFonts w:hint="eastAsia"/>
-                </w:rPr>
-                <w:delText xml:space="preserve">cluster </w:delText>
-              </w:r>
-            </w:del>
-            <w:ins w:id="438" w:author="zhaowenbo" w:date="2018-11-07T17:32:00Z">
-              <w:r>
-                <w:rPr>
-                  <w:rFonts w:hint="eastAsia"/>
-                </w:rPr>
-                <w:t>@</w:t>
-              </w:r>
-            </w:ins>
-            <w:r>
-              <w:t xml:space="preserve">zzz </w:t>
+              <w:t xml:space="preserve"> –user </w:t>
+            </w:r>
+            <w:r>
+              <w:rPr>
+                <w:rFonts w:hint="eastAsia"/>
+              </w:rPr>
+              <w:t>bar</w:t>
+            </w:r>
+            <w:r>
+              <w:t xml:space="preserve"> –cipherfile ./cipher</w:t>
             </w:r>
           </w:p>
           <w:p>
@@ -12657,6 +12713,9 @@
                 <w:numId w:val="24"/>
               </w:numPr>
               <w:ind w:firstLineChars="0"/>
+              <w:rPr>
+                <w:rFonts w:hint="eastAsia"/>
+              </w:rPr>
               <w:pPrChange w:id="439" w:author="zhaowenbo" w:date="2018-11-08T11:37:00Z">
                 <w:pPr>
                   <w:pStyle w:val="aa"/>
@@ -12677,13 +12736,7 @@
               <w:t>oo</w:t>
             </w:r>
             <w:r>
-              <w:t>l</w:t>
-            </w:r>
-            <w:r>
-              <w:t xml:space="preserve"> --hostname</w:t>
-            </w:r>
-            <w:r>
-              <w:t xml:space="preserve"> localhost --svcname</w:t>
+              <w:t>l --hostname localhost --svcname</w:t>
             </w:r>
             <w:r>
               <w:t xml:space="preserve"> </w:t>
@@ -12695,79 +12748,24 @@
               <w:t>11810</w:t>
             </w:r>
             <w:r>
-              <w:t xml:space="preserve"> –user </w:t>
-            </w:r>
-            <w:r>
-              <w:rPr>
-                <w:rFonts w:hint="eastAsia"/>
-              </w:rPr>
-              <w:t>bar</w:t>
-            </w:r>
-            <w:r>
-              <w:t xml:space="preserve"> –cipherfile ./cipher</w:t>
-            </w:r>
-          </w:p>
-          <w:p>
-            <w:pPr>
-              <w:pStyle w:val="aa"/>
-              <w:numPr>
-                <w:ilvl w:val="0"/>
-                <w:numId w:val="24"/>
-              </w:numPr>
-              <w:ind w:firstLineChars="0"/>
-              <w:rPr>
-                <w:rFonts w:hint="eastAsia"/>
-              </w:rPr>
-              <w:pPrChange w:id="440" w:author="zhaowenbo" w:date="2018-11-08T11:37:00Z">
-                <w:pPr>
-                  <w:pStyle w:val="aa"/>
-                  <w:numPr>
-                    <w:numId w:val="22"/>
-                  </w:numPr>
-                  <w:ind w:left="360" w:firstLineChars="0" w:hanging="360"/>
-                </w:pPr>
-              </w:pPrChange>
-            </w:pPr>
-            <w:r>
-              <w:t>T</w:t>
-            </w:r>
-            <w:r>
-              <w:rPr>
-                <w:rFonts w:hint="eastAsia"/>
-              </w:rPr>
-              <w:t>oo</w:t>
-            </w:r>
-            <w:r>
-              <w:t>l --hostname localhost --svcname</w:t>
-            </w:r>
-            <w:r>
               <w:t xml:space="preserve"> </w:t>
             </w:r>
             <w:r>
-              <w:rPr>
-                <w:rFonts w:hint="eastAsia"/>
-              </w:rPr>
-              <w:t>11810</w:t>
+              <w:t>–</w:t>
+            </w:r>
+            <w:r>
+              <w:t>user</w:t>
             </w:r>
             <w:r>
               <w:t xml:space="preserve"> </w:t>
             </w:r>
             <w:r>
-              <w:t>–</w:t>
-            </w:r>
-            <w:r>
-              <w:t>user</w:t>
-            </w:r>
-            <w:r>
-              <w:t xml:space="preserve"> </w:t>
-            </w:r>
-            <w:r>
               <w:rPr>
                 <w:rFonts w:hint="eastAsia"/>
               </w:rPr>
               <w:t>foo</w:t>
             </w:r>
-            <w:ins w:id="441" w:author="zhaowenbo" w:date="2018-11-08T11:38:00Z">
+            <w:ins w:id="440" w:author="zhaowenbo" w:date="2018-11-08T11:38:00Z">
               <w:r>
                 <w:t xml:space="preserve"> --password</w:t>
               </w:r>
@@ -12969,6 +12967,14 @@
                 <w:rFonts w:hint="eastAsia"/>
               </w:rPr>
             </w:pPr>
+            <w:ins w:id="441" w:author="zhaowenbo" w:date="2018-11-08T16:07:00Z">
+              <w:r>
+                <w:rPr>
+                  <w:rFonts w:hint="eastAsia"/>
+                </w:rPr>
+                <w:t>006</w:t>
+              </w:r>
+            </w:ins>
           </w:p>
         </w:tc>
         <w:tc>
@@ -12979,6 +12985,23 @@
             <w:pPr>
               <w:ind w:left="0"/>
             </w:pPr>
+            <w:ins w:id="442" w:author="zhaowenbo" w:date="2018-11-08T16:07:00Z">
+              <w:r>
+                <w:t>P</w:t>
+              </w:r>
+              <w:r>
+                <w:rPr>
+                  <w:rFonts w:hint="eastAsia"/>
+                </w:rPr>
+                <w:t>ostgresql</w:t>
+              </w:r>
+              <w:r>
+                <w:rPr>
+                  <w:rFonts w:hint="eastAsia"/>
+                </w:rPr>
+                <w:t>连接器</w:t>
+              </w:r>
+            </w:ins>
           </w:p>
         </w:tc>
         <w:tc>
@@ -12989,9 +13012,72 @@
             <w:pPr>
               <w:ind w:left="0"/>
               <w:rPr>
-                <w:rFonts w:hint="eastAsia"/>
-              </w:rPr>
-            </w:pPr>
+                <w:ins w:id="443" w:author="zhaowenbo" w:date="2018-11-08T16:07:00Z"/>
+              </w:rPr>
+            </w:pPr>
+            <w:ins w:id="444" w:author="zhaowenbo" w:date="2018-11-08T16:07:00Z">
+              <w:r>
+                <w:t>create server sdb_server</w:t>
+              </w:r>
+              <w:r>
+                <w:t xml:space="preserve"> foreign data wrapper sdb_fdw options(address '127.0.0.</w:t>
+              </w:r>
+              <w:r>
+                <w:t>1', service '50000', user '</w:t>
+              </w:r>
+            </w:ins>
+            <w:ins w:id="445" w:author="zhaowenbo" w:date="2018-11-08T16:09:00Z">
+              <w:r>
+                <w:rPr>
+                  <w:rFonts w:hint="eastAsia"/>
+                </w:rPr>
+                <w:t>xxx</w:t>
+              </w:r>
+            </w:ins>
+            <w:ins w:id="446" w:author="zhaowenbo" w:date="2018-11-08T16:07:00Z">
+              <w:r>
+                <w:t>', token '</w:t>
+              </w:r>
+            </w:ins>
+            <w:ins w:id="447" w:author="zhaowenbo" w:date="2018-11-08T16:09:00Z">
+              <w:r>
+                <w:rPr>
+                  <w:rFonts w:hint="eastAsia"/>
+                </w:rPr>
+                <w:t>xyz</w:t>
+              </w:r>
+            </w:ins>
+            <w:ins w:id="448" w:author="zhaowenbo" w:date="2018-11-08T16:07:00Z">
+              <w:r>
+                <w:t>', cipher 'on', cipherfile '/opt/sequoia</w:t>
+              </w:r>
+              <w:r>
+                <w:t>db/trunk/driver/</w:t>
+              </w:r>
+              <w:r>
+                <w:t>postgresql/passwd', preferedinstance 'A', transaction 'off');</w:t>
+              </w:r>
+              <w:bookmarkStart w:id="449" w:name="_GoBack"/>
+              <w:bookmarkEnd w:id="449"/>
+            </w:ins>
+          </w:p>
+          <w:p>
+            <w:pPr>
+              <w:ind w:left="0"/>
+              <w:rPr>
+                <w:rFonts w:hint="eastAsia"/>
+              </w:rPr>
+              <w:pPrChange w:id="450" w:author="zhaowenbo" w:date="2018-11-08T16:08:00Z">
+                <w:pPr>
+                  <w:ind w:left="0"/>
+                </w:pPr>
+              </w:pPrChange>
+            </w:pPr>
+            <w:ins w:id="451" w:author="zhaowenbo" w:date="2018-11-08T16:07:00Z">
+              <w:r>
+                <w:t>create foreign table test (c integer, d text) server sdb_server options ( collectionspace 'foo', collection 'bar', decimal 'on' ) ;</w:t>
+              </w:r>
+            </w:ins>
           </w:p>
         </w:tc>
         <w:tc>
@@ -13002,9 +13088,38 @@
             <w:pPr>
               <w:ind w:left="0"/>
               <w:rPr>
-                <w:rFonts w:hint="eastAsia"/>
-              </w:rPr>
-            </w:pPr>
+                <w:ins w:id="452" w:author="zhaowenbo" w:date="2018-11-08T16:08:00Z"/>
+              </w:rPr>
+            </w:pPr>
+            <w:ins w:id="453" w:author="zhaowenbo" w:date="2018-11-08T16:08:00Z">
+              <w:r>
+                <w:t>select * from test</w:t>
+              </w:r>
+              <w:r>
+                <w:t>;</w:t>
+              </w:r>
+            </w:ins>
+          </w:p>
+          <w:p>
+            <w:pPr>
+              <w:ind w:left="0"/>
+              <w:rPr>
+                <w:rFonts w:hint="eastAsia"/>
+                <w:rPrChange w:id="454" w:author="zhaowenbo" w:date="2018-11-08T16:08:00Z">
+                  <w:rPr>
+                    <w:rFonts w:hint="eastAsia"/>
+                  </w:rPr>
+                </w:rPrChange>
+              </w:rPr>
+            </w:pPr>
+            <w:ins w:id="455" w:author="zhaowenbo" w:date="2018-11-08T16:08:00Z">
+              <w:r>
+                <w:rPr>
+                  <w:rFonts w:hint="eastAsia"/>
+                </w:rPr>
+                <w:t>能够正常查询</w:t>
+              </w:r>
+            </w:ins>
           </w:p>
         </w:tc>
       </w:tr>
@@ -17393,7 +17508,7 @@
 </file>
 
 <file path=customXml/itemProps1.xml><?xml version="1.0" encoding="utf-8"?>
-<ds:datastoreItem xmlns:ds="http://schemas.openxmlformats.org/officeDocument/2006/customXml" ds:itemID="{8097E48B-8373-4986-B0BC-60258F279CC5}">
+<ds:datastoreItem xmlns:ds="http://schemas.openxmlformats.org/officeDocument/2006/customXml" ds:itemID="{7984DE2B-143F-4840-BC28-239A69E49B44}">
   <ds:schemaRefs>
     <ds:schemaRef ds:uri="http://schemas.openxmlformats.org/officeDocument/2006/bibliography"/>
   </ds:schemaRefs>

</xml_diff>